<commit_message>
Add some info to retrospective
</commit_message>
<xml_diff>
--- a/sprints/sprint2/Sprint Retrospective/Sprint Retrospective Report.docx
+++ b/sprints/sprint2/Sprint Retrospective/Sprint Retrospective Report.docx
@@ -1365,6 +1365,63 @@
           <w:tcPr>
             <w:tcW w:w="2316" w:type="dxa"/>
           </w:tcPr>
+          <w:p>
+            <w:proofErr w:type="gramStart"/>
+            <w:r>
+              <w:t>Taks</w:t>
+            </w:r>
+            <w:proofErr w:type="gramEnd"/>
+            <w:r>
+              <w:t xml:space="preserve"> moved to next sprint</w:t>
+            </w:r>
+          </w:p>
+        </w:tc>
+      </w:tr>
+      <w:tr>
+        <w:tc>
+          <w:tcPr>
+            <w:tcW w:w="3865" w:type="dxa"/>
+            <w:vAlign w:val="bottom"/>
+          </w:tcPr>
+          <w:p>
+            <w:r>
+              <w:rPr>
+                <w:rFonts w:ascii="Calibri" w:hAnsi="Calibri" w:cs="Calibri"/>
+                <w:color w:val="000000"/>
+              </w:rPr>
+              <w:t>Search Process Client Side</w:t>
+            </w:r>
+          </w:p>
+        </w:tc>
+        <w:tc>
+          <w:tcPr>
+            <w:tcW w:w="1530" w:type="dxa"/>
+            <w:vAlign w:val="bottom"/>
+          </w:tcPr>
+          <w:p>
+            <w:r>
+              <w:rPr>
+                <w:rFonts w:ascii="Calibri" w:hAnsi="Calibri" w:cs="Calibri"/>
+                <w:color w:val="000000"/>
+              </w:rPr>
+              <w:t>Victor</w:t>
+            </w:r>
+          </w:p>
+        </w:tc>
+        <w:tc>
+          <w:tcPr>
+            <w:tcW w:w="1639" w:type="dxa"/>
+          </w:tcPr>
+          <w:p>
+            <w:r>
+              <w:t>Not Started</w:t>
+            </w:r>
+          </w:p>
+        </w:tc>
+        <w:tc>
+          <w:tcPr>
+            <w:tcW w:w="2316" w:type="dxa"/>
+          </w:tcPr>
           <w:p/>
         </w:tc>
       </w:tr>
@@ -1380,7 +1437,7 @@
                 <w:rFonts w:ascii="Calibri" w:hAnsi="Calibri" w:cs="Calibri"/>
                 <w:color w:val="000000"/>
               </w:rPr>
-              <w:t>Search Process Client Side</w:t>
+              <w:t>Search Process Server Side</w:t>
             </w:r>
           </w:p>
         </w:tc>
@@ -1395,6 +1452,140 @@
                 <w:rFonts w:ascii="Calibri" w:hAnsi="Calibri" w:cs="Calibri"/>
                 <w:color w:val="000000"/>
               </w:rPr>
+              <w:t>Justin</w:t>
+            </w:r>
+          </w:p>
+        </w:tc>
+        <w:tc>
+          <w:tcPr>
+            <w:tcW w:w="1639" w:type="dxa"/>
+          </w:tcPr>
+          <w:p>
+            <w:r>
+              <w:t>Complete</w:t>
+            </w:r>
+          </w:p>
+        </w:tc>
+        <w:tc>
+          <w:tcPr>
+            <w:tcW w:w="2316" w:type="dxa"/>
+          </w:tcPr>
+          <w:p/>
+        </w:tc>
+      </w:tr>
+      <w:tr>
+        <w:tc>
+          <w:tcPr>
+            <w:tcW w:w="3865" w:type="dxa"/>
+            <w:vAlign w:val="bottom"/>
+          </w:tcPr>
+          <w:p>
+            <w:r>
+              <w:rPr>
+                <w:rFonts w:ascii="Calibri" w:hAnsi="Calibri" w:cs="Calibri"/>
+                <w:color w:val="000000"/>
+              </w:rPr>
+              <w:t xml:space="preserve">Update </w:t>
+            </w:r>
+            <w:proofErr w:type="spellStart"/>
+            <w:r>
+              <w:rPr>
+                <w:rFonts w:ascii="Calibri" w:hAnsi="Calibri" w:cs="Calibri"/>
+                <w:color w:val="000000"/>
+              </w:rPr>
+              <w:t>DayOfFood</w:t>
+            </w:r>
+            <w:proofErr w:type="spellEnd"/>
+            <w:r>
+              <w:rPr>
+                <w:rFonts w:ascii="Calibri" w:hAnsi="Calibri" w:cs="Calibri"/>
+                <w:color w:val="000000"/>
+              </w:rPr>
+              <w:t xml:space="preserve"> Process Client Side</w:t>
+            </w:r>
+          </w:p>
+        </w:tc>
+        <w:tc>
+          <w:tcPr>
+            <w:tcW w:w="1530" w:type="dxa"/>
+            <w:vAlign w:val="bottom"/>
+          </w:tcPr>
+          <w:p>
+            <w:pPr>
+              <w:rPr>
+                <w:rFonts w:ascii="Calibri" w:hAnsi="Calibri" w:cs="Calibri"/>
+                <w:color w:val="000000"/>
+              </w:rPr>
+            </w:pPr>
+            <w:r>
+              <w:rPr>
+                <w:rFonts w:ascii="Calibri" w:hAnsi="Calibri" w:cs="Calibri"/>
+                <w:color w:val="000000"/>
+              </w:rPr>
+              <w:t>Emi</w:t>
+            </w:r>
+          </w:p>
+        </w:tc>
+        <w:tc>
+          <w:tcPr>
+            <w:tcW w:w="1639" w:type="dxa"/>
+          </w:tcPr>
+          <w:p>
+            <w:r>
+              <w:t>Not Started</w:t>
+            </w:r>
+          </w:p>
+        </w:tc>
+        <w:tc>
+          <w:tcPr>
+            <w:tcW w:w="2316" w:type="dxa"/>
+          </w:tcPr>
+          <w:p/>
+        </w:tc>
+      </w:tr>
+      <w:tr>
+        <w:tc>
+          <w:tcPr>
+            <w:tcW w:w="3865" w:type="dxa"/>
+            <w:vAlign w:val="bottom"/>
+          </w:tcPr>
+          <w:p>
+            <w:r>
+              <w:rPr>
+                <w:rFonts w:ascii="Calibri" w:hAnsi="Calibri" w:cs="Calibri"/>
+                <w:color w:val="000000"/>
+              </w:rPr>
+              <w:t xml:space="preserve">Update </w:t>
+            </w:r>
+            <w:proofErr w:type="spellStart"/>
+            <w:r>
+              <w:rPr>
+                <w:rFonts w:ascii="Calibri" w:hAnsi="Calibri" w:cs="Calibri"/>
+                <w:color w:val="000000"/>
+              </w:rPr>
+              <w:t>DayOfFood</w:t>
+            </w:r>
+            <w:proofErr w:type="spellEnd"/>
+            <w:r>
+              <w:rPr>
+                <w:rFonts w:ascii="Calibri" w:hAnsi="Calibri" w:cs="Calibri"/>
+                <w:color w:val="000000"/>
+              </w:rPr>
+              <w:t xml:space="preserve"> Process Server Side</w:t>
+            </w:r>
+          </w:p>
+        </w:tc>
+        <w:tc>
+          <w:tcPr>
+            <w:tcW w:w="1530" w:type="dxa"/>
+            <w:vAlign w:val="bottom"/>
+          </w:tcPr>
+          <w:p>
+            <w:r>
+              <w:rPr>
+                <w:rFonts w:ascii="Calibri" w:hAnsi="Calibri" w:cs="Calibri"/>
+                <w:color w:val="000000"/>
+              </w:rPr>
               <w:t>Victor</w:t>
             </w:r>
           </w:p>
@@ -1428,7 +1619,24 @@
                 <w:rFonts w:ascii="Calibri" w:hAnsi="Calibri" w:cs="Calibri"/>
                 <w:color w:val="000000"/>
               </w:rPr>
-              <w:t>Search Process Server Side</w:t>
+              <w:lastRenderedPageBreak/>
+              <w:t xml:space="preserve">Communication </w:t>
+            </w:r>
+            <w:proofErr w:type="spellStart"/>
+            <w:r>
+              <w:rPr>
+                <w:rFonts w:ascii="Calibri" w:hAnsi="Calibri" w:cs="Calibri"/>
+                <w:color w:val="000000"/>
+              </w:rPr>
+              <w:t>Protecol</w:t>
+            </w:r>
+            <w:proofErr w:type="spellEnd"/>
+            <w:r>
+              <w:rPr>
+                <w:rFonts w:ascii="Calibri" w:hAnsi="Calibri" w:cs="Calibri"/>
+                <w:color w:val="000000"/>
+              </w:rPr>
+              <w:t xml:space="preserve"> for Update Diet</w:t>
             </w:r>
           </w:p>
         </w:tc>
@@ -1438,6 +1646,12 @@
             <w:vAlign w:val="bottom"/>
           </w:tcPr>
           <w:p>
+            <w:pPr>
+              <w:rPr>
+                <w:rFonts w:ascii="Calibri" w:hAnsi="Calibri" w:cs="Calibri"/>
+                <w:color w:val="000000"/>
+              </w:rPr>
+            </w:pPr>
             <w:r>
               <w:rPr>
                 <w:rFonts w:ascii="Calibri" w:hAnsi="Calibri" w:cs="Calibri"/>
@@ -1476,211 +1690,6 @@
                 <w:rFonts w:ascii="Calibri" w:hAnsi="Calibri" w:cs="Calibri"/>
                 <w:color w:val="000000"/>
               </w:rPr>
-              <w:t xml:space="preserve">Update </w:t>
-            </w:r>
-            <w:proofErr w:type="spellStart"/>
-            <w:r>
-              <w:rPr>
-                <w:rFonts w:ascii="Calibri" w:hAnsi="Calibri" w:cs="Calibri"/>
-                <w:color w:val="000000"/>
-              </w:rPr>
-              <w:t>DayOfFood</w:t>
-            </w:r>
-            <w:proofErr w:type="spellEnd"/>
-            <w:r>
-              <w:rPr>
-                <w:rFonts w:ascii="Calibri" w:hAnsi="Calibri" w:cs="Calibri"/>
-                <w:color w:val="000000"/>
-              </w:rPr>
-              <w:t xml:space="preserve"> Process Client Side</w:t>
-            </w:r>
-          </w:p>
-        </w:tc>
-        <w:tc>
-          <w:tcPr>
-            <w:tcW w:w="1530" w:type="dxa"/>
-            <w:vAlign w:val="bottom"/>
-          </w:tcPr>
-          <w:p>
-            <w:pPr>
-              <w:rPr>
-                <w:rFonts w:ascii="Calibri" w:hAnsi="Calibri" w:cs="Calibri"/>
-                <w:color w:val="000000"/>
-              </w:rPr>
-            </w:pPr>
-            <w:r>
-              <w:rPr>
-                <w:rFonts w:ascii="Calibri" w:hAnsi="Calibri" w:cs="Calibri"/>
-                <w:color w:val="000000"/>
-              </w:rPr>
-              <w:t>Emi</w:t>
-            </w:r>
-          </w:p>
-        </w:tc>
-        <w:tc>
-          <w:tcPr>
-            <w:tcW w:w="1639" w:type="dxa"/>
-          </w:tcPr>
-          <w:p>
-            <w:r>
-              <w:t>Not Started</w:t>
-            </w:r>
-          </w:p>
-        </w:tc>
-        <w:tc>
-          <w:tcPr>
-            <w:tcW w:w="2316" w:type="dxa"/>
-          </w:tcPr>
-          <w:p/>
-        </w:tc>
-      </w:tr>
-      <w:tr>
-        <w:tc>
-          <w:tcPr>
-            <w:tcW w:w="3865" w:type="dxa"/>
-            <w:vAlign w:val="bottom"/>
-          </w:tcPr>
-          <w:p>
-            <w:r>
-              <w:rPr>
-                <w:rFonts w:ascii="Calibri" w:hAnsi="Calibri" w:cs="Calibri"/>
-                <w:color w:val="000000"/>
-              </w:rPr>
-              <w:t xml:space="preserve">Update </w:t>
-            </w:r>
-            <w:proofErr w:type="spellStart"/>
-            <w:r>
-              <w:rPr>
-                <w:rFonts w:ascii="Calibri" w:hAnsi="Calibri" w:cs="Calibri"/>
-                <w:color w:val="000000"/>
-              </w:rPr>
-              <w:t>DayOfFood</w:t>
-            </w:r>
-            <w:proofErr w:type="spellEnd"/>
-            <w:r>
-              <w:rPr>
-                <w:rFonts w:ascii="Calibri" w:hAnsi="Calibri" w:cs="Calibri"/>
-                <w:color w:val="000000"/>
-              </w:rPr>
-              <w:t xml:space="preserve"> Process Server Side</w:t>
-            </w:r>
-          </w:p>
-        </w:tc>
-        <w:tc>
-          <w:tcPr>
-            <w:tcW w:w="1530" w:type="dxa"/>
-            <w:vAlign w:val="bottom"/>
-          </w:tcPr>
-          <w:p>
-            <w:r>
-              <w:rPr>
-                <w:rFonts w:ascii="Calibri" w:hAnsi="Calibri" w:cs="Calibri"/>
-                <w:color w:val="000000"/>
-              </w:rPr>
-              <w:t>Victor</w:t>
-            </w:r>
-          </w:p>
-        </w:tc>
-        <w:tc>
-          <w:tcPr>
-            <w:tcW w:w="1639" w:type="dxa"/>
-          </w:tcPr>
-          <w:p>
-            <w:r>
-              <w:t>Not Started</w:t>
-            </w:r>
-          </w:p>
-        </w:tc>
-        <w:tc>
-          <w:tcPr>
-            <w:tcW w:w="2316" w:type="dxa"/>
-          </w:tcPr>
-          <w:p/>
-        </w:tc>
-      </w:tr>
-      <w:tr>
-        <w:tc>
-          <w:tcPr>
-            <w:tcW w:w="3865" w:type="dxa"/>
-            <w:vAlign w:val="bottom"/>
-          </w:tcPr>
-          <w:p>
-            <w:r>
-              <w:rPr>
-                <w:rFonts w:ascii="Calibri" w:hAnsi="Calibri" w:cs="Calibri"/>
-                <w:color w:val="000000"/>
-              </w:rPr>
-              <w:t xml:space="preserve">Communication </w:t>
-            </w:r>
-            <w:proofErr w:type="spellStart"/>
-            <w:r>
-              <w:rPr>
-                <w:rFonts w:ascii="Calibri" w:hAnsi="Calibri" w:cs="Calibri"/>
-                <w:color w:val="000000"/>
-              </w:rPr>
-              <w:t>Protecol</w:t>
-            </w:r>
-            <w:proofErr w:type="spellEnd"/>
-            <w:r>
-              <w:rPr>
-                <w:rFonts w:ascii="Calibri" w:hAnsi="Calibri" w:cs="Calibri"/>
-                <w:color w:val="000000"/>
-              </w:rPr>
-              <w:t xml:space="preserve"> for Update Diet</w:t>
-            </w:r>
-          </w:p>
-        </w:tc>
-        <w:tc>
-          <w:tcPr>
-            <w:tcW w:w="1530" w:type="dxa"/>
-            <w:vAlign w:val="bottom"/>
-          </w:tcPr>
-          <w:p>
-            <w:pPr>
-              <w:rPr>
-                <w:rFonts w:ascii="Calibri" w:hAnsi="Calibri" w:cs="Calibri"/>
-                <w:color w:val="000000"/>
-              </w:rPr>
-            </w:pPr>
-            <w:r>
-              <w:rPr>
-                <w:rFonts w:ascii="Calibri" w:hAnsi="Calibri" w:cs="Calibri"/>
-                <w:color w:val="000000"/>
-              </w:rPr>
-              <w:t>Justin</w:t>
-            </w:r>
-          </w:p>
-        </w:tc>
-        <w:tc>
-          <w:tcPr>
-            <w:tcW w:w="1639" w:type="dxa"/>
-          </w:tcPr>
-          <w:p>
-            <w:r>
-              <w:t>Complete</w:t>
-            </w:r>
-          </w:p>
-        </w:tc>
-        <w:tc>
-          <w:tcPr>
-            <w:tcW w:w="2316" w:type="dxa"/>
-          </w:tcPr>
-          <w:p/>
-        </w:tc>
-      </w:tr>
-      <w:tr>
-        <w:tc>
-          <w:tcPr>
-            <w:tcW w:w="3865" w:type="dxa"/>
-            <w:vAlign w:val="bottom"/>
-          </w:tcPr>
-          <w:p>
-            <w:r>
-              <w:rPr>
-                <w:rFonts w:ascii="Calibri" w:hAnsi="Calibri" w:cs="Calibri"/>
-                <w:color w:val="000000"/>
-              </w:rPr>
-              <w:lastRenderedPageBreak/>
               <w:t>Account Menu UI</w:t>
             </w:r>
           </w:p>
@@ -2144,21 +2153,29 @@
           <w:tcPr>
             <w:tcW w:w="1615" w:type="dxa"/>
           </w:tcPr>
+          <w:p>
+            <w:r>
+              <w:t>Yeni Almanza</w:t>
+            </w:r>
+          </w:p>
+        </w:tc>
+        <w:tc>
+          <w:tcPr>
+            <w:tcW w:w="7735" w:type="dxa"/>
+          </w:tcPr>
           <w:p/>
         </w:tc>
-        <w:tc>
-          <w:tcPr>
-            <w:tcW w:w="7735" w:type="dxa"/>
-          </w:tcPr>
-          <w:p/>
-        </w:tc>
       </w:tr>
       <w:tr>
         <w:tc>
           <w:tcPr>
             <w:tcW w:w="1615" w:type="dxa"/>
           </w:tcPr>
-          <w:p/>
+          <w:p>
+            <w:r>
+              <w:t>Yeni Almanza</w:t>
+            </w:r>
+          </w:p>
         </w:tc>
         <w:tc>
           <w:tcPr>

</xml_diff>

<commit_message>
Filled in spint retrospective
Added my part to the sprint retrospective and included
documents used for AI promts.
</commit_message>
<xml_diff>
--- a/sprints/sprint2/Sprint Retrospective/Sprint Retrospective Report.docx
+++ b/sprints/sprint2/Sprint Retrospective/Sprint Retrospective Report.docx
@@ -20,6 +20,9 @@
       <w:r>
         <w:t>Date Submitted:</w:t>
       </w:r>
+      <w:r>
+        <w:t>4/ /26</w:t>
+      </w:r>
     </w:p>
     <w:p>
       <w:r>
@@ -49,6 +52,9 @@
       </w:r>
       <w:r>
         <w:t xml:space="preserve"> Justin Smith</w:t>
+      </w:r>
+      <w:r>
+        <w:t>, Yeni Almanza</w:t>
       </w:r>
     </w:p>
     <w:p>
@@ -225,23 +231,7 @@
                 <w:rFonts w:ascii="Calibri" w:hAnsi="Calibri" w:cs="Calibri"/>
                 <w:color w:val="000000"/>
               </w:rPr>
-              <w:t xml:space="preserve">Communication </w:t>
-            </w:r>
-            <w:proofErr w:type="spellStart"/>
-            <w:r>
-              <w:rPr>
-                <w:rFonts w:ascii="Calibri" w:hAnsi="Calibri" w:cs="Calibri"/>
-                <w:color w:val="000000"/>
-              </w:rPr>
-              <w:t>Protecol</w:t>
-            </w:r>
-            <w:proofErr w:type="spellEnd"/>
-            <w:r>
-              <w:rPr>
-                <w:rFonts w:ascii="Calibri" w:hAnsi="Calibri" w:cs="Calibri"/>
-                <w:color w:val="000000"/>
-              </w:rPr>
-              <w:t xml:space="preserve"> for authorization process</w:t>
+              <w:t>Communication Protecol for authorization process</w:t>
             </w:r>
           </w:p>
         </w:tc>
@@ -536,17 +526,8 @@
                 <w:rFonts w:ascii="Calibri" w:hAnsi="Calibri" w:cs="Calibri"/>
                 <w:color w:val="000000"/>
               </w:rPr>
-              <w:t xml:space="preserve">Login Page </w:t>
-            </w:r>
-            <w:proofErr w:type="spellStart"/>
-            <w:r>
-              <w:rPr>
-                <w:rFonts w:ascii="Calibri" w:hAnsi="Calibri" w:cs="Calibri"/>
-                <w:color w:val="000000"/>
-              </w:rPr>
-              <w:t>Codebehind</w:t>
-            </w:r>
-            <w:proofErr w:type="spellEnd"/>
+              <w:t>Login Page Codebehind</w:t>
+            </w:r>
           </w:p>
         </w:tc>
         <w:tc>
@@ -593,23 +574,7 @@
                 <w:rFonts w:ascii="Calibri" w:hAnsi="Calibri" w:cs="Calibri"/>
                 <w:color w:val="000000"/>
               </w:rPr>
-              <w:t xml:space="preserve">Communication </w:t>
-            </w:r>
-            <w:proofErr w:type="spellStart"/>
-            <w:r>
-              <w:rPr>
-                <w:rFonts w:ascii="Calibri" w:hAnsi="Calibri" w:cs="Calibri"/>
-                <w:color w:val="000000"/>
-              </w:rPr>
-              <w:t>Protecol</w:t>
-            </w:r>
-            <w:proofErr w:type="spellEnd"/>
-            <w:r>
-              <w:rPr>
-                <w:rFonts w:ascii="Calibri" w:hAnsi="Calibri" w:cs="Calibri"/>
-                <w:color w:val="000000"/>
-              </w:rPr>
-              <w:t xml:space="preserve"> for Create Account</w:t>
+              <w:t>Communication Protecol for Create Account</w:t>
             </w:r>
           </w:p>
         </w:tc>
@@ -862,23 +827,7 @@
                 <w:rFonts w:ascii="Calibri" w:hAnsi="Calibri" w:cs="Calibri"/>
                 <w:color w:val="000000"/>
               </w:rPr>
-              <w:t xml:space="preserve">Communication </w:t>
-            </w:r>
-            <w:proofErr w:type="spellStart"/>
-            <w:r>
-              <w:rPr>
-                <w:rFonts w:ascii="Calibri" w:hAnsi="Calibri" w:cs="Calibri"/>
-                <w:color w:val="000000"/>
-              </w:rPr>
-              <w:t>Protecol</w:t>
-            </w:r>
-            <w:proofErr w:type="spellEnd"/>
-            <w:r>
-              <w:rPr>
-                <w:rFonts w:ascii="Calibri" w:hAnsi="Calibri" w:cs="Calibri"/>
-                <w:color w:val="000000"/>
-              </w:rPr>
-              <w:t xml:space="preserve"> for Create Food</w:t>
+              <w:t>Communication Protecol for Create Food</w:t>
             </w:r>
           </w:p>
         </w:tc>
@@ -1028,23 +977,7 @@
                 <w:rFonts w:ascii="Calibri" w:hAnsi="Calibri" w:cs="Calibri"/>
                 <w:color w:val="000000"/>
               </w:rPr>
-              <w:t xml:space="preserve">Communication </w:t>
-            </w:r>
-            <w:proofErr w:type="spellStart"/>
-            <w:r>
-              <w:rPr>
-                <w:rFonts w:ascii="Calibri" w:hAnsi="Calibri" w:cs="Calibri"/>
-                <w:color w:val="000000"/>
-              </w:rPr>
-              <w:t>Protecol</w:t>
-            </w:r>
-            <w:proofErr w:type="spellEnd"/>
-            <w:r>
-              <w:rPr>
-                <w:rFonts w:ascii="Calibri" w:hAnsi="Calibri" w:cs="Calibri"/>
-                <w:color w:val="000000"/>
-              </w:rPr>
-              <w:t xml:space="preserve"> for Search</w:t>
+              <w:t>Communication Protecol for Search</w:t>
             </w:r>
           </w:p>
         </w:tc>
@@ -1098,33 +1031,8 @@
                 <w:rFonts w:ascii="Calibri" w:hAnsi="Calibri" w:cs="Calibri"/>
                 <w:color w:val="000000"/>
               </w:rPr>
-              <w:t xml:space="preserve">Communication </w:t>
-            </w:r>
-            <w:proofErr w:type="spellStart"/>
-            <w:r>
-              <w:rPr>
-                <w:rFonts w:ascii="Calibri" w:hAnsi="Calibri" w:cs="Calibri"/>
-                <w:color w:val="000000"/>
-              </w:rPr>
-              <w:t>Protecol</w:t>
-            </w:r>
-            <w:proofErr w:type="spellEnd"/>
-            <w:r>
-              <w:rPr>
-                <w:rFonts w:ascii="Calibri" w:hAnsi="Calibri" w:cs="Calibri"/>
-                <w:color w:val="000000"/>
-              </w:rPr>
-              <w:t xml:space="preserve"> for Update </w:t>
-            </w:r>
-            <w:proofErr w:type="spellStart"/>
-            <w:r>
-              <w:rPr>
-                <w:rFonts w:ascii="Calibri" w:hAnsi="Calibri" w:cs="Calibri"/>
-                <w:color w:val="000000"/>
-              </w:rPr>
-              <w:t>FoodLog</w:t>
-            </w:r>
-            <w:proofErr w:type="spellEnd"/>
+              <w:t>Communication Protecol for Update FoodLog</w:t>
+            </w:r>
           </w:p>
         </w:tc>
         <w:tc>
@@ -1172,21 +1080,12 @@
             <w:vAlign w:val="bottom"/>
           </w:tcPr>
           <w:p>
-            <w:proofErr w:type="spellStart"/>
-            <w:r>
-              <w:rPr>
-                <w:rFonts w:ascii="Calibri" w:hAnsi="Calibri" w:cs="Calibri"/>
-                <w:color w:val="000000"/>
-              </w:rPr>
-              <w:t>FoodLog</w:t>
-            </w:r>
-            <w:proofErr w:type="spellEnd"/>
-            <w:r>
-              <w:rPr>
-                <w:rFonts w:ascii="Calibri" w:hAnsi="Calibri" w:cs="Calibri"/>
-                <w:color w:val="000000"/>
-              </w:rPr>
-              <w:t xml:space="preserve"> Structure</w:t>
+            <w:r>
+              <w:rPr>
+                <w:rFonts w:ascii="Calibri" w:hAnsi="Calibri" w:cs="Calibri"/>
+                <w:color w:val="000000"/>
+              </w:rPr>
+              <w:t>FoodLog Structure</w:t>
             </w:r>
           </w:p>
         </w:tc>
@@ -1366,13 +1265,11 @@
             <w:tcW w:w="2316" w:type="dxa"/>
           </w:tcPr>
           <w:p>
-            <w:proofErr w:type="gramStart"/>
-            <w:r>
-              <w:t>Taks</w:t>
-            </w:r>
-            <w:proofErr w:type="gramEnd"/>
-            <w:r>
-              <w:t xml:space="preserve"> moved to next sprint</w:t>
+            <w:r>
+              <w:t xml:space="preserve">Task was </w:t>
+            </w:r>
+            <w:r>
+              <w:t>moved to next sprint</w:t>
             </w:r>
           </w:p>
         </w:tc>
@@ -1485,23 +1382,7 @@
                 <w:rFonts w:ascii="Calibri" w:hAnsi="Calibri" w:cs="Calibri"/>
                 <w:color w:val="000000"/>
               </w:rPr>
-              <w:t xml:space="preserve">Update </w:t>
-            </w:r>
-            <w:proofErr w:type="spellStart"/>
-            <w:r>
-              <w:rPr>
-                <w:rFonts w:ascii="Calibri" w:hAnsi="Calibri" w:cs="Calibri"/>
-                <w:color w:val="000000"/>
-              </w:rPr>
-              <w:t>DayOfFood</w:t>
-            </w:r>
-            <w:proofErr w:type="spellEnd"/>
-            <w:r>
-              <w:rPr>
-                <w:rFonts w:ascii="Calibri" w:hAnsi="Calibri" w:cs="Calibri"/>
-                <w:color w:val="000000"/>
-              </w:rPr>
-              <w:t xml:space="preserve"> Process Client Side</w:t>
+              <w:t>Update DayOfFood Process Client Side</w:t>
             </w:r>
           </w:p>
         </w:tc>
@@ -1555,23 +1436,7 @@
                 <w:rFonts w:ascii="Calibri" w:hAnsi="Calibri" w:cs="Calibri"/>
                 <w:color w:val="000000"/>
               </w:rPr>
-              <w:t xml:space="preserve">Update </w:t>
-            </w:r>
-            <w:proofErr w:type="spellStart"/>
-            <w:r>
-              <w:rPr>
-                <w:rFonts w:ascii="Calibri" w:hAnsi="Calibri" w:cs="Calibri"/>
-                <w:color w:val="000000"/>
-              </w:rPr>
-              <w:t>DayOfFood</w:t>
-            </w:r>
-            <w:proofErr w:type="spellEnd"/>
-            <w:r>
-              <w:rPr>
-                <w:rFonts w:ascii="Calibri" w:hAnsi="Calibri" w:cs="Calibri"/>
-                <w:color w:val="000000"/>
-              </w:rPr>
-              <w:t xml:space="preserve"> Process Server Side</w:t>
+              <w:t>Update DayOfFood Process Server Side</w:t>
             </w:r>
           </w:p>
         </w:tc>
@@ -1620,23 +1485,7 @@
                 <w:color w:val="000000"/>
               </w:rPr>
               <w:lastRenderedPageBreak/>
-              <w:t xml:space="preserve">Communication </w:t>
-            </w:r>
-            <w:proofErr w:type="spellStart"/>
-            <w:r>
-              <w:rPr>
-                <w:rFonts w:ascii="Calibri" w:hAnsi="Calibri" w:cs="Calibri"/>
-                <w:color w:val="000000"/>
-              </w:rPr>
-              <w:t>Protecol</w:t>
-            </w:r>
-            <w:proofErr w:type="spellEnd"/>
-            <w:r>
-              <w:rPr>
-                <w:rFonts w:ascii="Calibri" w:hAnsi="Calibri" w:cs="Calibri"/>
-                <w:color w:val="000000"/>
-              </w:rPr>
-              <w:t xml:space="preserve"> for Update Diet</w:t>
+              <w:t>Communication Protecol for Update Diet</w:t>
             </w:r>
           </w:p>
         </w:tc>
@@ -1904,17 +1753,8 @@
                 <w:rFonts w:ascii="Calibri" w:hAnsi="Calibri" w:cs="Calibri"/>
                 <w:color w:val="000000"/>
               </w:rPr>
-              <w:t xml:space="preserve">Edit Diet </w:t>
-            </w:r>
-            <w:proofErr w:type="spellStart"/>
-            <w:r>
-              <w:rPr>
-                <w:rFonts w:ascii="Calibri" w:hAnsi="Calibri" w:cs="Calibri"/>
-                <w:color w:val="000000"/>
-              </w:rPr>
-              <w:t>Codebehind</w:t>
-            </w:r>
-            <w:proofErr w:type="spellEnd"/>
+              <w:t>Edit Diet Codebehind</w:t>
+            </w:r>
           </w:p>
         </w:tc>
         <w:tc>
@@ -1990,21 +1830,8 @@
           <w:numId w:val="1"/>
         </w:numPr>
       </w:pPr>
-      <w:proofErr w:type="gramStart"/>
-      <w:r>
-        <w:t>A git</w:t>
-      </w:r>
-      <w:proofErr w:type="gramEnd"/>
-      <w:r>
-        <w:t xml:space="preserve"> </w:t>
-      </w:r>
-      <w:proofErr w:type="gramStart"/>
-      <w:r>
-        <w:t>commit</w:t>
-      </w:r>
-      <w:proofErr w:type="gramEnd"/>
-      <w:r>
-        <w:t xml:space="preserve"> message</w:t>
+      <w:r>
+        <w:t>A git commit message</w:t>
       </w:r>
       <w:r>
         <w:t xml:space="preserve"> (please include the commit ID and date/time)</w:t>
@@ -2163,7 +1990,81 @@
           <w:tcPr>
             <w:tcW w:w="7735" w:type="dxa"/>
           </w:tcPr>
+          <w:p>
+            <w:r>
+              <w:t>Fixed some merge conflicts in our controller classes</w:t>
+            </w:r>
+            <w:r>
+              <w:t xml:space="preserve"> by comparing </w:t>
+            </w:r>
+            <w:r>
+              <w:t xml:space="preserve">the </w:t>
+            </w:r>
+            <w:r>
+              <w:t>main</w:t>
+            </w:r>
+            <w:r>
+              <w:t xml:space="preserve"> branch</w:t>
+            </w:r>
+            <w:r>
+              <w:t xml:space="preserve"> to </w:t>
+            </w:r>
+            <w:r>
+              <w:t>documentation-ClassDiagram</w:t>
+            </w:r>
+            <w:r>
+              <w:t xml:space="preserve"> branch</w:t>
+            </w:r>
+            <w:r>
+              <w:t xml:space="preserve">. </w:t>
+            </w:r>
+            <w:r>
+              <w:t>Only one c</w:t>
+            </w:r>
+            <w:r>
+              <w:t>ontroller had some changes</w:t>
+            </w:r>
+            <w:r>
+              <w:t xml:space="preserve"> than the others</w:t>
+            </w:r>
+            <w:r>
+              <w:t xml:space="preserve"> but </w:t>
+            </w:r>
+            <w:r>
+              <w:t>merge was a success and no bugs were found.</w:t>
+            </w:r>
+          </w:p>
+          <w:p>
+            <w:r>
+              <w:t>commit ae1c7a9abfa64d355a8dc2648041227341b726cb (HEAD -&gt; main, origin/main, origin/HEAD)</w:t>
+            </w:r>
+          </w:p>
+          <w:p>
+            <w:r>
+              <w:t>Merge: 5bff933 23673f0</w:t>
+            </w:r>
+          </w:p>
+          <w:p>
+            <w:r>
+              <w:t>Author: Yeni Almanza &lt;127815619+almanzayeni@users.noreply.github.com&gt;</w:t>
+            </w:r>
+          </w:p>
+          <w:p>
+            <w:r>
+              <w:t>Date:   Fri Apr 10 16:44:41 2026 -0400</w:t>
+            </w:r>
+          </w:p>
           <w:p/>
+          <w:p>
+            <w:r>
+              <w:t>    Merge pull request #47 from almanzayeni/documentation-ClassDiagram</w:t>
+            </w:r>
+          </w:p>
+          <w:p>
+            <w:r>
+              <w:t>    Documentation class diagram</w:t>
+            </w:r>
+          </w:p>
         </w:tc>
       </w:tr>
       <w:tr>
@@ -2176,6 +2077,82 @@
               <w:t>Yeni Almanza</w:t>
             </w:r>
           </w:p>
+        </w:tc>
+        <w:tc>
+          <w:tcPr>
+            <w:tcW w:w="7735" w:type="dxa"/>
+          </w:tcPr>
+          <w:p>
+            <w:r>
+              <w:t xml:space="preserve">Created a branch and started the class diagram for the python </w:t>
+            </w:r>
+            <w:r>
+              <w:t>project.</w:t>
+            </w:r>
+          </w:p>
+          <w:p>
+            <w:r>
+              <w:t>commit 9ba5eed2907250cc64ace74a476b4885e5851fc9</w:t>
+            </w:r>
+          </w:p>
+          <w:p>
+            <w:r>
+              <w:t>Author: Yeni Almanza &lt;ya00013@my.westga.edu&gt;</w:t>
+            </w:r>
+          </w:p>
+          <w:p>
+            <w:r>
+              <w:t>Date:   Wed Apr 8 12:15:04 2026 -0400</w:t>
+            </w:r>
+          </w:p>
+          <w:p/>
+          <w:p>
+            <w:r>
+              <w:t>    Add python class diagram</w:t>
+            </w:r>
+          </w:p>
+          <w:p>
+            <w:r>
+              <w:t>    Started the python class diagram</w:t>
+            </w:r>
+          </w:p>
+          <w:p/>
+        </w:tc>
+      </w:tr>
+      <w:tr>
+        <w:tc>
+          <w:tcPr>
+            <w:tcW w:w="1615" w:type="dxa"/>
+          </w:tcPr>
+          <w:p/>
+        </w:tc>
+        <w:tc>
+          <w:tcPr>
+            <w:tcW w:w="7735" w:type="dxa"/>
+          </w:tcPr>
+          <w:p/>
+        </w:tc>
+      </w:tr>
+      <w:tr>
+        <w:tc>
+          <w:tcPr>
+            <w:tcW w:w="1615" w:type="dxa"/>
+          </w:tcPr>
+          <w:p/>
+        </w:tc>
+        <w:tc>
+          <w:tcPr>
+            <w:tcW w:w="7735" w:type="dxa"/>
+          </w:tcPr>
+          <w:p/>
+        </w:tc>
+      </w:tr>
+      <w:tr>
+        <w:tc>
+          <w:tcPr>
+            <w:tcW w:w="1615" w:type="dxa"/>
+          </w:tcPr>
+          <w:p/>
         </w:tc>
         <w:tc>
           <w:tcPr>
@@ -2465,23 +2442,7 @@
                 <w:rFonts w:ascii="Calibri" w:hAnsi="Calibri" w:cs="Calibri"/>
                 <w:color w:val="000000"/>
               </w:rPr>
-              <w:t xml:space="preserve">Update </w:t>
-            </w:r>
-            <w:proofErr w:type="spellStart"/>
-            <w:r>
-              <w:rPr>
-                <w:rFonts w:ascii="Calibri" w:hAnsi="Calibri" w:cs="Calibri"/>
-                <w:color w:val="000000"/>
-              </w:rPr>
-              <w:t>DayOfFood</w:t>
-            </w:r>
-            <w:proofErr w:type="spellEnd"/>
-            <w:r>
-              <w:rPr>
-                <w:rFonts w:ascii="Calibri" w:hAnsi="Calibri" w:cs="Calibri"/>
-                <w:color w:val="000000"/>
-              </w:rPr>
-              <w:t xml:space="preserve"> Process Client Side</w:t>
+              <w:t>Update DayOfFood Process Client Side</w:t>
             </w:r>
           </w:p>
         </w:tc>
@@ -2534,23 +2495,7 @@
                 <w:rFonts w:ascii="Calibri" w:hAnsi="Calibri" w:cs="Calibri"/>
                 <w:color w:val="000000"/>
               </w:rPr>
-              <w:t xml:space="preserve">Update </w:t>
-            </w:r>
-            <w:proofErr w:type="spellStart"/>
-            <w:r>
-              <w:rPr>
-                <w:rFonts w:ascii="Calibri" w:hAnsi="Calibri" w:cs="Calibri"/>
-                <w:color w:val="000000"/>
-              </w:rPr>
-              <w:t>DayOfFood</w:t>
-            </w:r>
-            <w:proofErr w:type="spellEnd"/>
-            <w:r>
-              <w:rPr>
-                <w:rFonts w:ascii="Calibri" w:hAnsi="Calibri" w:cs="Calibri"/>
-                <w:color w:val="000000"/>
-              </w:rPr>
-              <w:t xml:space="preserve"> Process Server Side</w:t>
+              <w:t>Update DayOfFood Process Server Side</w:t>
             </w:r>
           </w:p>
         </w:tc>
@@ -2603,17 +2548,8 @@
                 <w:rFonts w:ascii="Calibri" w:hAnsi="Calibri" w:cs="Calibri"/>
                 <w:color w:val="000000"/>
               </w:rPr>
-              <w:t xml:space="preserve">Add Food </w:t>
-            </w:r>
-            <w:proofErr w:type="spellStart"/>
-            <w:r>
-              <w:rPr>
-                <w:rFonts w:ascii="Calibri" w:hAnsi="Calibri" w:cs="Calibri"/>
-                <w:color w:val="000000"/>
-              </w:rPr>
-              <w:t>Codebehind</w:t>
-            </w:r>
-            <w:proofErr w:type="spellEnd"/>
+              <w:t>Add Food Codebehind</w:t>
+            </w:r>
           </w:p>
         </w:tc>
         <w:tc>
@@ -2659,23 +2595,7 @@
                 <w:rFonts w:ascii="Calibri" w:hAnsi="Calibri" w:cs="Calibri"/>
                 <w:color w:val="000000"/>
               </w:rPr>
-              <w:t xml:space="preserve">Update </w:t>
-            </w:r>
-            <w:proofErr w:type="spellStart"/>
-            <w:r>
-              <w:rPr>
-                <w:rFonts w:ascii="Calibri" w:hAnsi="Calibri" w:cs="Calibri"/>
-                <w:color w:val="000000"/>
-              </w:rPr>
-              <w:t>HomeDashboard</w:t>
-            </w:r>
-            <w:proofErr w:type="spellEnd"/>
-            <w:r>
-              <w:rPr>
-                <w:rFonts w:ascii="Calibri" w:hAnsi="Calibri" w:cs="Calibri"/>
-                <w:color w:val="000000"/>
-              </w:rPr>
-              <w:t xml:space="preserve"> UI</w:t>
+              <w:t>Update HomeDashboard UI</w:t>
             </w:r>
           </w:p>
         </w:tc>
@@ -2769,33 +2689,8 @@
                 <w:rFonts w:ascii="Calibri" w:hAnsi="Calibri" w:cs="Calibri"/>
                 <w:color w:val="000000"/>
               </w:rPr>
-              <w:t xml:space="preserve">Update </w:t>
-            </w:r>
-            <w:proofErr w:type="spellStart"/>
-            <w:r>
-              <w:rPr>
-                <w:rFonts w:ascii="Calibri" w:hAnsi="Calibri" w:cs="Calibri"/>
-                <w:color w:val="000000"/>
-              </w:rPr>
-              <w:t>HomeDashboard</w:t>
-            </w:r>
-            <w:proofErr w:type="spellEnd"/>
-            <w:r>
-              <w:rPr>
-                <w:rFonts w:ascii="Calibri" w:hAnsi="Calibri" w:cs="Calibri"/>
-                <w:color w:val="000000"/>
-              </w:rPr>
-              <w:t xml:space="preserve"> </w:t>
-            </w:r>
-            <w:proofErr w:type="spellStart"/>
-            <w:r>
-              <w:rPr>
-                <w:rFonts w:ascii="Calibri" w:hAnsi="Calibri" w:cs="Calibri"/>
-                <w:color w:val="000000"/>
-              </w:rPr>
-              <w:t>Codebehind</w:t>
-            </w:r>
-            <w:proofErr w:type="spellEnd"/>
+              <w:t>Update HomeDashboard Codebehind</w:t>
+            </w:r>
           </w:p>
         </w:tc>
         <w:tc>
@@ -3029,17 +2924,8 @@
                 <w:rFonts w:ascii="Calibri" w:hAnsi="Calibri" w:cs="Calibri"/>
                 <w:color w:val="000000"/>
               </w:rPr>
-              <w:t xml:space="preserve">Edit Diet </w:t>
-            </w:r>
-            <w:proofErr w:type="spellStart"/>
-            <w:r>
-              <w:rPr>
-                <w:rFonts w:ascii="Calibri" w:hAnsi="Calibri" w:cs="Calibri"/>
-                <w:color w:val="000000"/>
-              </w:rPr>
-              <w:t>Codebehind</w:t>
-            </w:r>
-            <w:proofErr w:type="spellEnd"/>
+              <w:t>Edit Diet Codebehind</w:t>
+            </w:r>
           </w:p>
         </w:tc>
         <w:tc>
@@ -3065,7 +2951,6 @@
         <w:pStyle w:val="Heading1"/>
       </w:pPr>
       <w:r>
-        <w:lastRenderedPageBreak/>
         <w:t>Report on Generative AI Use</w:t>
       </w:r>
     </w:p>
@@ -3185,6 +3070,228 @@
         </w:rPr>
         <w:t>ID of the commit that includes the related source code or documentation changes (state “no changes made” if the session did not lead to any changes)</w:t>
       </w:r>
+    </w:p>
+    <w:p>
+      <w:pPr>
+        <w:rPr>
+          <w:b/>
+          <w:bCs/>
+        </w:rPr>
+      </w:pPr>
+    </w:p>
+    <w:p>
+      <w:pPr>
+        <w:pStyle w:val="ListParagraph"/>
+        <w:numPr>
+          <w:ilvl w:val="0"/>
+          <w:numId w:val="6"/>
+        </w:numPr>
+        <w:rPr>
+          <w:b/>
+          <w:bCs/>
+        </w:rPr>
+      </w:pPr>
+      <w:r>
+        <w:rPr>
+          <w:b/>
+          <w:bCs/>
+        </w:rPr>
+        <w:t>Yeni Almanza</w:t>
+      </w:r>
+    </w:p>
+    <w:p>
+      <w:pPr>
+        <w:pStyle w:val="ListParagraph"/>
+        <w:numPr>
+          <w:ilvl w:val="0"/>
+          <w:numId w:val="6"/>
+        </w:numPr>
+        <w:rPr>
+          <w:b/>
+          <w:bCs/>
+        </w:rPr>
+      </w:pPr>
+      <w:r>
+        <w:rPr>
+          <w:b/>
+          <w:bCs/>
+        </w:rPr>
+        <w:t>YA – Claude explained server side for create account and implemented parts of the server.</w:t>
+      </w:r>
+    </w:p>
+    <w:p>
+      <w:pPr>
+        <w:pStyle w:val="ListParagraph"/>
+        <w:numPr>
+          <w:ilvl w:val="0"/>
+          <w:numId w:val="6"/>
+        </w:numPr>
+        <w:rPr>
+          <w:b/>
+          <w:bCs/>
+        </w:rPr>
+      </w:pPr>
+      <w:r>
+        <w:rPr>
+          <w:b/>
+          <w:bCs/>
+        </w:rPr>
+        <w:t>commit 297f6d82983386030f7f5ecd69de711707b2d68a</w:t>
+      </w:r>
+      <w:r>
+        <w:rPr>
+          <w:b/>
+          <w:bCs/>
+        </w:rPr>
+        <w:t xml:space="preserve"> (snippets of code were used)</w:t>
+      </w:r>
+    </w:p>
+    <w:p>
+      <w:pPr>
+        <w:pStyle w:val="ListParagraph"/>
+        <w:rPr>
+          <w:b/>
+          <w:bCs/>
+        </w:rPr>
+      </w:pPr>
+    </w:p>
+    <w:p>
+      <w:pPr>
+        <w:pStyle w:val="ListParagraph"/>
+        <w:numPr>
+          <w:ilvl w:val="0"/>
+          <w:numId w:val="4"/>
+        </w:numPr>
+        <w:rPr>
+          <w:b/>
+          <w:bCs/>
+        </w:rPr>
+      </w:pPr>
+      <w:r>
+        <w:rPr>
+          <w:b/>
+          <w:bCs/>
+        </w:rPr>
+        <w:t>Yeni Almanza</w:t>
+      </w:r>
+    </w:p>
+    <w:p>
+      <w:pPr>
+        <w:pStyle w:val="ListParagraph"/>
+        <w:numPr>
+          <w:ilvl w:val="0"/>
+          <w:numId w:val="4"/>
+        </w:numPr>
+        <w:rPr>
+          <w:b/>
+          <w:bCs/>
+        </w:rPr>
+      </w:pPr>
+      <w:r>
+        <w:rPr>
+          <w:b/>
+          <w:bCs/>
+        </w:rPr>
+        <w:t>YA – Ask</w:t>
+      </w:r>
+      <w:r>
+        <w:rPr>
+          <w:b/>
+          <w:bCs/>
+        </w:rPr>
+        <w:t xml:space="preserve">ed </w:t>
+      </w:r>
+      <w:r>
+        <w:rPr>
+          <w:b/>
+          <w:bCs/>
+        </w:rPr>
+        <w:t>Claude</w:t>
+      </w:r>
+      <w:r>
+        <w:rPr>
+          <w:b/>
+          <w:bCs/>
+        </w:rPr>
+        <w:t xml:space="preserve"> to help generate some error handling</w:t>
+      </w:r>
+      <w:r>
+        <w:rPr>
+          <w:b/>
+          <w:bCs/>
+        </w:rPr>
+        <w:t xml:space="preserve"> files</w:t>
+      </w:r>
+      <w:r>
+        <w:rPr>
+          <w:b/>
+          <w:bCs/>
+        </w:rPr>
+        <w:t xml:space="preserve"> for classes</w:t>
+      </w:r>
+      <w:r>
+        <w:rPr>
+          <w:b/>
+          <w:bCs/>
+        </w:rPr>
+        <w:t xml:space="preserve"> and </w:t>
+      </w:r>
+      <w:r>
+        <w:rPr>
+          <w:b/>
+          <w:bCs/>
+        </w:rPr>
+        <w:t>help fix the menu for the dashboard</w:t>
+      </w:r>
+      <w:r>
+        <w:rPr>
+          <w:b/>
+          <w:bCs/>
+        </w:rPr>
+        <w:t>.</w:t>
+      </w:r>
+    </w:p>
+    <w:p>
+      <w:pPr>
+        <w:pStyle w:val="ListParagraph"/>
+        <w:numPr>
+          <w:ilvl w:val="0"/>
+          <w:numId w:val="4"/>
+        </w:numPr>
+        <w:rPr>
+          <w:b/>
+          <w:bCs/>
+        </w:rPr>
+      </w:pPr>
+      <w:r>
+        <w:rPr>
+          <w:b/>
+          <w:bCs/>
+        </w:rPr>
+        <w:t>commit 79c2274bfaa45c39b7e97a10181c12a121d77fda</w:t>
+      </w:r>
+      <w:r>
+        <w:rPr>
+          <w:b/>
+          <w:bCs/>
+        </w:rPr>
+        <w:t xml:space="preserve"> </w:t>
+      </w:r>
+      <w:r>
+        <w:rPr>
+          <w:b/>
+          <w:bCs/>
+        </w:rPr>
+        <w:t>(most files were not used just snippets)</w:t>
+      </w:r>
+    </w:p>
+    <w:p>
+      <w:pPr>
+        <w:rPr>
+          <w:b/>
+          <w:bCs/>
+        </w:rPr>
+      </w:pPr>
     </w:p>
     <w:sectPr>
       <w:pgSz w:w="12240" w:h="15840"/>
@@ -3199,6 +3306,95 @@
 <file path=word/numbering.xml><?xml version="1.0" encoding="utf-8"?>
 <w:numbering xmlns:wpc="http://schemas.microsoft.com/office/word/2010/wordprocessingCanvas" xmlns:cx="http://schemas.microsoft.com/office/drawing/2014/chartex" xmlns:cx1="http://schemas.microsoft.com/office/drawing/2015/9/8/chartex" xmlns:cx2="http://schemas.microsoft.com/office/drawing/2015/10/21/chartex" xmlns:cx3="http://schemas.microsoft.com/office/drawing/2016/5/9/chartex" xmlns:cx4="http://schemas.microsoft.com/office/drawing/2016/5/10/chartex" xmlns:cx5="http://schemas.microsoft.com/office/drawing/2016/5/11/chartex" xmlns:cx6="http://schemas.microsoft.com/office/drawing/2016/5/12/chartex" xmlns:cx7="http://schemas.microsoft.com/office/drawing/2016/5/13/chartex" xmlns:cx8="http://schemas.microsoft.com/office/drawing/2016/5/14/chartex" xmlns:mc="http://schemas.openxmlformats.org/markup-compatibility/2006" xmlns:aink="http://schemas.microsoft.com/office/drawing/2016/ink" xmlns:am3d="http://schemas.microsoft.com/office/drawing/2017/model3d" xmlns:o="urn:schemas-microsoft-com:office:office" xmlns:oel="http://schemas.microsoft.com/office/2019/extlst" xmlns:r="http://schemas.openxmlformats.org/officeDocument/2006/relationships" xmlns:m="http://schemas.openxmlformats.org/officeDocument/2006/math" xmlns:v="urn:schemas-microsoft-com:vml" xmlns:wp14="http://schemas.microsoft.com/office/word/2010/wordprocessingDrawing" xmlns:wp="http://schemas.openxmlformats.org/drawingml/2006/wordprocessingDrawing" xmlns:w10="urn:schemas-microsoft-com:office:word" xmlns:w="http://schemas.openxmlformats.org/wordprocessingml/2006/main" xmlns:w14="http://schemas.microsoft.com/office/word/2010/wordml" xmlns:w15="http://schemas.microsoft.com/office/word/2012/wordml" xmlns:w16cex="http://schemas.microsoft.com/office/word/2018/wordml/cex" xmlns:w16cid="http://schemas.microsoft.com/office/word/2016/wordml/cid" xmlns:w16="http://schemas.microsoft.com/office/word/2018/wordml" xmlns:w16du="http://schemas.microsoft.com/office/word/2023/wordml/word16du" xmlns:w16sdtdh="http://schemas.microsoft.com/office/word/2020/wordml/sdtdatahash" xmlns:w16sdtfl="http://schemas.microsoft.com/office/word/2024/wordml/sdtformatlock" xmlns:w16se="http://schemas.microsoft.com/office/word/2015/wordml/symex" xmlns:wpg="http://schemas.microsoft.com/office/word/2010/wordprocessingGroup" xmlns:wpi="http://schemas.microsoft.com/office/word/2010/wordprocessingInk" xmlns:wne="http://schemas.microsoft.com/office/word/2006/wordml" xmlns:wps="http://schemas.microsoft.com/office/word/2010/wordprocessingShape" mc:Ignorable="w14 w15 w16se w16cid w16 w16cex w16sdtdh w16sdtfl w16du wp14">
   <w:abstractNum w:abstractNumId="0" w15:restartNumberingAfterBreak="0">
+    <w:nsid w:val="28A279A8"/>
+    <w:multiLevelType w:val="hybridMultilevel"/>
+    <w:tmpl w:val="D604EDB4"/>
+    <w:lvl w:ilvl="0" w:tplc="0409000F">
+      <w:start w:val="1"/>
+      <w:numFmt w:val="decimal"/>
+      <w:lvlText w:val="%1."/>
+      <w:lvlJc w:val="left"/>
+      <w:pPr>
+        <w:ind w:left="720" w:hanging="360"/>
+      </w:pPr>
+      <w:rPr>
+        <w:rFonts w:hint="default"/>
+      </w:rPr>
+    </w:lvl>
+    <w:lvl w:ilvl="1" w:tplc="04090019" w:tentative="1">
+      <w:start w:val="1"/>
+      <w:numFmt w:val="lowerLetter"/>
+      <w:lvlText w:val="%2."/>
+      <w:lvlJc w:val="left"/>
+      <w:pPr>
+        <w:ind w:left="1440" w:hanging="360"/>
+      </w:pPr>
+    </w:lvl>
+    <w:lvl w:ilvl="2" w:tplc="0409001B" w:tentative="1">
+      <w:start w:val="1"/>
+      <w:numFmt w:val="lowerRoman"/>
+      <w:lvlText w:val="%3."/>
+      <w:lvlJc w:val="right"/>
+      <w:pPr>
+        <w:ind w:left="2160" w:hanging="180"/>
+      </w:pPr>
+    </w:lvl>
+    <w:lvl w:ilvl="3" w:tplc="0409000F" w:tentative="1">
+      <w:start w:val="1"/>
+      <w:numFmt w:val="decimal"/>
+      <w:lvlText w:val="%4."/>
+      <w:lvlJc w:val="left"/>
+      <w:pPr>
+        <w:ind w:left="2880" w:hanging="360"/>
+      </w:pPr>
+    </w:lvl>
+    <w:lvl w:ilvl="4" w:tplc="04090019" w:tentative="1">
+      <w:start w:val="1"/>
+      <w:numFmt w:val="lowerLetter"/>
+      <w:lvlText w:val="%5."/>
+      <w:lvlJc w:val="left"/>
+      <w:pPr>
+        <w:ind w:left="3600" w:hanging="360"/>
+      </w:pPr>
+    </w:lvl>
+    <w:lvl w:ilvl="5" w:tplc="0409001B" w:tentative="1">
+      <w:start w:val="1"/>
+      <w:numFmt w:val="lowerRoman"/>
+      <w:lvlText w:val="%6."/>
+      <w:lvlJc w:val="right"/>
+      <w:pPr>
+        <w:ind w:left="4320" w:hanging="180"/>
+      </w:pPr>
+    </w:lvl>
+    <w:lvl w:ilvl="6" w:tplc="0409000F" w:tentative="1">
+      <w:start w:val="1"/>
+      <w:numFmt w:val="decimal"/>
+      <w:lvlText w:val="%7."/>
+      <w:lvlJc w:val="left"/>
+      <w:pPr>
+        <w:ind w:left="5040" w:hanging="360"/>
+      </w:pPr>
+    </w:lvl>
+    <w:lvl w:ilvl="7" w:tplc="04090019" w:tentative="1">
+      <w:start w:val="1"/>
+      <w:numFmt w:val="lowerLetter"/>
+      <w:lvlText w:val="%8."/>
+      <w:lvlJc w:val="left"/>
+      <w:pPr>
+        <w:ind w:left="5760" w:hanging="360"/>
+      </w:pPr>
+    </w:lvl>
+    <w:lvl w:ilvl="8" w:tplc="0409001B" w:tentative="1">
+      <w:start w:val="1"/>
+      <w:numFmt w:val="lowerRoman"/>
+      <w:lvlText w:val="%9."/>
+      <w:lvlJc w:val="right"/>
+      <w:pPr>
+        <w:ind w:left="6480" w:hanging="180"/>
+      </w:pPr>
+    </w:lvl>
+  </w:abstractNum>
+  <w:abstractNum w:abstractNumId="1" w15:restartNumberingAfterBreak="0">
     <w:nsid w:val="40F1172E"/>
     <w:multiLevelType w:val="hybridMultilevel"/>
     <w:tmpl w:val="ED30E1E8"/>
@@ -3311,7 +3507,7 @@
       </w:rPr>
     </w:lvl>
   </w:abstractNum>
-  <w:abstractNum w:abstractNumId="1" w15:restartNumberingAfterBreak="0">
+  <w:abstractNum w:abstractNumId="2" w15:restartNumberingAfterBreak="0">
     <w:nsid w:val="5BD5494F"/>
     <w:multiLevelType w:val="hybridMultilevel"/>
     <w:tmpl w:val="1DD6E0B2"/>
@@ -3424,7 +3620,96 @@
       </w:rPr>
     </w:lvl>
   </w:abstractNum>
-  <w:abstractNum w:abstractNumId="2" w15:restartNumberingAfterBreak="0">
+  <w:abstractNum w:abstractNumId="3" w15:restartNumberingAfterBreak="0">
+    <w:nsid w:val="5C6E3A02"/>
+    <w:multiLevelType w:val="hybridMultilevel"/>
+    <w:tmpl w:val="472E1434"/>
+    <w:lvl w:ilvl="0" w:tplc="0409000F">
+      <w:start w:val="1"/>
+      <w:numFmt w:val="decimal"/>
+      <w:lvlText w:val="%1."/>
+      <w:lvlJc w:val="left"/>
+      <w:pPr>
+        <w:ind w:left="720" w:hanging="360"/>
+      </w:pPr>
+      <w:rPr>
+        <w:rFonts w:hint="default"/>
+      </w:rPr>
+    </w:lvl>
+    <w:lvl w:ilvl="1" w:tplc="04090019" w:tentative="1">
+      <w:start w:val="1"/>
+      <w:numFmt w:val="lowerLetter"/>
+      <w:lvlText w:val="%2."/>
+      <w:lvlJc w:val="left"/>
+      <w:pPr>
+        <w:ind w:left="1440" w:hanging="360"/>
+      </w:pPr>
+    </w:lvl>
+    <w:lvl w:ilvl="2" w:tplc="0409001B" w:tentative="1">
+      <w:start w:val="1"/>
+      <w:numFmt w:val="lowerRoman"/>
+      <w:lvlText w:val="%3."/>
+      <w:lvlJc w:val="right"/>
+      <w:pPr>
+        <w:ind w:left="2160" w:hanging="180"/>
+      </w:pPr>
+    </w:lvl>
+    <w:lvl w:ilvl="3" w:tplc="0409000F" w:tentative="1">
+      <w:start w:val="1"/>
+      <w:numFmt w:val="decimal"/>
+      <w:lvlText w:val="%4."/>
+      <w:lvlJc w:val="left"/>
+      <w:pPr>
+        <w:ind w:left="2880" w:hanging="360"/>
+      </w:pPr>
+    </w:lvl>
+    <w:lvl w:ilvl="4" w:tplc="04090019" w:tentative="1">
+      <w:start w:val="1"/>
+      <w:numFmt w:val="lowerLetter"/>
+      <w:lvlText w:val="%5."/>
+      <w:lvlJc w:val="left"/>
+      <w:pPr>
+        <w:ind w:left="3600" w:hanging="360"/>
+      </w:pPr>
+    </w:lvl>
+    <w:lvl w:ilvl="5" w:tplc="0409001B" w:tentative="1">
+      <w:start w:val="1"/>
+      <w:numFmt w:val="lowerRoman"/>
+      <w:lvlText w:val="%6."/>
+      <w:lvlJc w:val="right"/>
+      <w:pPr>
+        <w:ind w:left="4320" w:hanging="180"/>
+      </w:pPr>
+    </w:lvl>
+    <w:lvl w:ilvl="6" w:tplc="0409000F" w:tentative="1">
+      <w:start w:val="1"/>
+      <w:numFmt w:val="decimal"/>
+      <w:lvlText w:val="%7."/>
+      <w:lvlJc w:val="left"/>
+      <w:pPr>
+        <w:ind w:left="5040" w:hanging="360"/>
+      </w:pPr>
+    </w:lvl>
+    <w:lvl w:ilvl="7" w:tplc="04090019" w:tentative="1">
+      <w:start w:val="1"/>
+      <w:numFmt w:val="lowerLetter"/>
+      <w:lvlText w:val="%8."/>
+      <w:lvlJc w:val="left"/>
+      <w:pPr>
+        <w:ind w:left="5760" w:hanging="360"/>
+      </w:pPr>
+    </w:lvl>
+    <w:lvl w:ilvl="8" w:tplc="0409001B" w:tentative="1">
+      <w:start w:val="1"/>
+      <w:numFmt w:val="lowerRoman"/>
+      <w:lvlText w:val="%9."/>
+      <w:lvlJc w:val="right"/>
+      <w:pPr>
+        <w:ind w:left="6480" w:hanging="180"/>
+      </w:pPr>
+    </w:lvl>
+  </w:abstractNum>
+  <w:abstractNum w:abstractNumId="4" w15:restartNumberingAfterBreak="0">
     <w:nsid w:val="73490412"/>
     <w:multiLevelType w:val="hybridMultilevel"/>
     <w:tmpl w:val="C13246B0"/>
@@ -3510,14 +3795,112 @@
       </w:pPr>
     </w:lvl>
   </w:abstractNum>
+  <w:abstractNum w:abstractNumId="5" w15:restartNumberingAfterBreak="0">
+    <w:nsid w:val="7688157B"/>
+    <w:multiLevelType w:val="hybridMultilevel"/>
+    <w:tmpl w:val="6E4A939E"/>
+    <w:lvl w:ilvl="0" w:tplc="0409000F">
+      <w:start w:val="1"/>
+      <w:numFmt w:val="decimal"/>
+      <w:lvlText w:val="%1."/>
+      <w:lvlJc w:val="left"/>
+      <w:pPr>
+        <w:ind w:left="720" w:hanging="360"/>
+      </w:pPr>
+      <w:rPr>
+        <w:rFonts w:hint="default"/>
+      </w:rPr>
+    </w:lvl>
+    <w:lvl w:ilvl="1" w:tplc="04090019" w:tentative="1">
+      <w:start w:val="1"/>
+      <w:numFmt w:val="lowerLetter"/>
+      <w:lvlText w:val="%2."/>
+      <w:lvlJc w:val="left"/>
+      <w:pPr>
+        <w:ind w:left="1440" w:hanging="360"/>
+      </w:pPr>
+    </w:lvl>
+    <w:lvl w:ilvl="2" w:tplc="0409001B" w:tentative="1">
+      <w:start w:val="1"/>
+      <w:numFmt w:val="lowerRoman"/>
+      <w:lvlText w:val="%3."/>
+      <w:lvlJc w:val="right"/>
+      <w:pPr>
+        <w:ind w:left="2160" w:hanging="180"/>
+      </w:pPr>
+    </w:lvl>
+    <w:lvl w:ilvl="3" w:tplc="0409000F" w:tentative="1">
+      <w:start w:val="1"/>
+      <w:numFmt w:val="decimal"/>
+      <w:lvlText w:val="%4."/>
+      <w:lvlJc w:val="left"/>
+      <w:pPr>
+        <w:ind w:left="2880" w:hanging="360"/>
+      </w:pPr>
+    </w:lvl>
+    <w:lvl w:ilvl="4" w:tplc="04090019" w:tentative="1">
+      <w:start w:val="1"/>
+      <w:numFmt w:val="lowerLetter"/>
+      <w:lvlText w:val="%5."/>
+      <w:lvlJc w:val="left"/>
+      <w:pPr>
+        <w:ind w:left="3600" w:hanging="360"/>
+      </w:pPr>
+    </w:lvl>
+    <w:lvl w:ilvl="5" w:tplc="0409001B" w:tentative="1">
+      <w:start w:val="1"/>
+      <w:numFmt w:val="lowerRoman"/>
+      <w:lvlText w:val="%6."/>
+      <w:lvlJc w:val="right"/>
+      <w:pPr>
+        <w:ind w:left="4320" w:hanging="180"/>
+      </w:pPr>
+    </w:lvl>
+    <w:lvl w:ilvl="6" w:tplc="0409000F" w:tentative="1">
+      <w:start w:val="1"/>
+      <w:numFmt w:val="decimal"/>
+      <w:lvlText w:val="%7."/>
+      <w:lvlJc w:val="left"/>
+      <w:pPr>
+        <w:ind w:left="5040" w:hanging="360"/>
+      </w:pPr>
+    </w:lvl>
+    <w:lvl w:ilvl="7" w:tplc="04090019" w:tentative="1">
+      <w:start w:val="1"/>
+      <w:numFmt w:val="lowerLetter"/>
+      <w:lvlText w:val="%8."/>
+      <w:lvlJc w:val="left"/>
+      <w:pPr>
+        <w:ind w:left="5760" w:hanging="360"/>
+      </w:pPr>
+    </w:lvl>
+    <w:lvl w:ilvl="8" w:tplc="0409001B" w:tentative="1">
+      <w:start w:val="1"/>
+      <w:numFmt w:val="lowerRoman"/>
+      <w:lvlText w:val="%9."/>
+      <w:lvlJc w:val="right"/>
+      <w:pPr>
+        <w:ind w:left="6480" w:hanging="180"/>
+      </w:pPr>
+    </w:lvl>
+  </w:abstractNum>
   <w:num w:numId="1" w16cid:durableId="1314723760">
+    <w:abstractNumId w:val="2"/>
+  </w:num>
+  <w:num w:numId="2" w16cid:durableId="611401654">
     <w:abstractNumId w:val="1"/>
   </w:num>
-  <w:num w:numId="2" w16cid:durableId="611401654">
+  <w:num w:numId="3" w16cid:durableId="479267999">
+    <w:abstractNumId w:val="4"/>
+  </w:num>
+  <w:num w:numId="4" w16cid:durableId="602810082">
     <w:abstractNumId w:val="0"/>
   </w:num>
-  <w:num w:numId="3" w16cid:durableId="479267999">
-    <w:abstractNumId w:val="2"/>
+  <w:num w:numId="5" w16cid:durableId="110560326">
+    <w:abstractNumId w:val="3"/>
+  </w:num>
+  <w:num w:numId="6" w16cid:durableId="311720692">
+    <w:abstractNumId w:val="5"/>
   </w:num>
 </w:numbering>
 </file>
@@ -3947,7 +4330,6 @@
   <w:style w:type="character" w:default="1" w:styleId="DefaultParagraphFont">
     <w:name w:val="Default Paragraph Font"/>
     <w:uiPriority w:val="1"/>
-    <w:semiHidden/>
     <w:unhideWhenUsed/>
   </w:style>
   <w:style w:type="table" w:default="1" w:styleId="TableNormal">
@@ -4077,6 +4459,24 @@
       <w:color w:val="2F5496" w:themeColor="accent1" w:themeShade="BF"/>
       <w:sz w:val="32"/>
       <w:szCs w:val="32"/>
+    </w:rPr>
+  </w:style>
+  <w:style w:type="paragraph" w:styleId="NormalWeb">
+    <w:name w:val="Normal (Web)"/>
+    <w:basedOn w:val="Normal"/>
+    <w:uiPriority w:val="99"/>
+    <w:semiHidden/>
+    <w:unhideWhenUsed/>
+    <w:rsid w:val="00384EDF"/>
+    <w:pPr>
+      <w:spacing w:before="100" w:beforeAutospacing="1" w:after="100" w:afterAutospacing="1" w:line="240" w:lineRule="auto"/>
+    </w:pPr>
+    <w:rPr>
+      <w:rFonts w:ascii="Times New Roman" w:eastAsia="Times New Roman" w:hAnsi="Times New Roman" w:cs="Times New Roman"/>
+      <w:kern w:val="0"/>
+      <w:sz w:val="24"/>
+      <w:szCs w:val="24"/>
+      <w14:ligatures w14:val="none"/>
     </w:rPr>
   </w:style>
 </w:styles>

</xml_diff>

<commit_message>
Update Sprint Retrospective, Add VF chat files
</commit_message>
<xml_diff>
--- a/sprints/sprint2/Sprint Retrospective/Sprint Retrospective Report.docx
+++ b/sprints/sprint2/Sprint Retrospective/Sprint Retrospective Report.docx
@@ -55,6 +55,9 @@
       </w:r>
       <w:r>
         <w:t>, Yeni Almanza</w:t>
+      </w:r>
+      <w:r>
+        <w:t>, Victor Filpo</w:t>
       </w:r>
     </w:p>
     <w:p>
@@ -2124,13 +2127,21 @@
           <w:tcPr>
             <w:tcW w:w="1615" w:type="dxa"/>
           </w:tcPr>
-          <w:p/>
+          <w:p>
+            <w:r>
+              <w:t>Victor Filpo</w:t>
+            </w:r>
+          </w:p>
         </w:tc>
         <w:tc>
           <w:tcPr>
             <w:tcW w:w="7735" w:type="dxa"/>
           </w:tcPr>
-          <w:p/>
+          <w:p>
+            <w:r>
+              <w:t>Commit 00b7057 4/6/26 @7PM - Create food feature server-side complete</w:t>
+            </w:r>
+          </w:p>
         </w:tc>
       </w:tr>
       <w:tr>
@@ -2138,13 +2149,21 @@
           <w:tcPr>
             <w:tcW w:w="1615" w:type="dxa"/>
           </w:tcPr>
-          <w:p/>
+          <w:p>
+            <w:r>
+              <w:t>Victor Filpo</w:t>
+            </w:r>
+          </w:p>
         </w:tc>
         <w:tc>
           <w:tcPr>
             <w:tcW w:w="7735" w:type="dxa"/>
           </w:tcPr>
-          <w:p/>
+          <w:p>
+            <w:r>
+              <w:t>Commit fe2bb1b 3/31/26 @7PM - DashBoard populates User name and FoodLog once logged in</w:t>
+            </w:r>
+          </w:p>
         </w:tc>
       </w:tr>
       <w:tr>
@@ -2152,13 +2171,21 @@
           <w:tcPr>
             <w:tcW w:w="1615" w:type="dxa"/>
           </w:tcPr>
-          <w:p/>
+          <w:p>
+            <w:r>
+              <w:t>Victor Filpo</w:t>
+            </w:r>
+          </w:p>
         </w:tc>
         <w:tc>
           <w:tcPr>
             <w:tcW w:w="7735" w:type="dxa"/>
           </w:tcPr>
-          <w:p/>
+          <w:p>
+            <w:r>
+              <w:t>Buggy hamburger menu navigation at times - Issue #40</w:t>
+            </w:r>
+          </w:p>
         </w:tc>
       </w:tr>
       <w:tr>
@@ -3283,6 +3310,315 @@
           <w:bCs/>
         </w:rPr>
         <w:t>(most files were not used just snippets)</w:t>
+      </w:r>
+    </w:p>
+    <w:p>
+      <w:pPr>
+        <w:rPr>
+          <w:b/>
+          <w:bCs/>
+        </w:rPr>
+      </w:pPr>
+      <w:r>
+        <w:rPr>
+          <w:b/>
+          <w:bCs/>
+        </w:rPr>
+        <w:br w:type="page"/>
+      </w:r>
+    </w:p>
+    <w:p>
+      <w:pPr>
+        <w:rPr>
+          <w:b/>
+          <w:bCs/>
+        </w:rPr>
+      </w:pPr>
+    </w:p>
+    <w:p>
+      <w:pPr>
+        <w:pStyle w:val="ListParagraph"/>
+        <w:numPr>
+          <w:ilvl w:val="0"/>
+          <w:numId w:val="8"/>
+        </w:numPr>
+        <w:rPr>
+          <w:b/>
+          <w:bCs/>
+        </w:rPr>
+      </w:pPr>
+      <w:r>
+        <w:rPr>
+          <w:b/>
+          <w:bCs/>
+        </w:rPr>
+        <w:t>Victor Filpo</w:t>
+      </w:r>
+    </w:p>
+    <w:p>
+      <w:pPr>
+        <w:pStyle w:val="ListParagraph"/>
+        <w:numPr>
+          <w:ilvl w:val="0"/>
+          <w:numId w:val="8"/>
+        </w:numPr>
+        <w:rPr>
+          <w:b/>
+          <w:bCs/>
+        </w:rPr>
+      </w:pPr>
+      <w:r>
+        <w:rPr>
+          <w:b/>
+          <w:bCs/>
+        </w:rPr>
+        <w:t>VF - Adding food data update functionality server</w:t>
+      </w:r>
+    </w:p>
+    <w:p>
+      <w:pPr>
+        <w:pStyle w:val="ListParagraph"/>
+        <w:numPr>
+          <w:ilvl w:val="0"/>
+          <w:numId w:val="8"/>
+        </w:numPr>
+        <w:rPr>
+          <w:b/>
+          <w:bCs/>
+        </w:rPr>
+      </w:pPr>
+      <w:r>
+        <w:rPr>
+          <w:b/>
+          <w:bCs/>
+        </w:rPr>
+        <w:t>Generate example code of how to connect client and server for adding food data</w:t>
+      </w:r>
+    </w:p>
+    <w:p>
+      <w:pPr>
+        <w:pStyle w:val="ListParagraph"/>
+        <w:numPr>
+          <w:ilvl w:val="0"/>
+          <w:numId w:val="8"/>
+        </w:numPr>
+        <w:rPr>
+          <w:b/>
+          <w:bCs/>
+        </w:rPr>
+      </w:pPr>
+      <w:r>
+        <w:rPr>
+          <w:b/>
+          <w:bCs/>
+        </w:rPr>
+        <w:t>00b705706e58e1061de398045c94b14f036f894d</w:t>
+      </w:r>
+    </w:p>
+    <w:p>
+      <w:pPr>
+        <w:rPr>
+          <w:b/>
+          <w:bCs/>
+        </w:rPr>
+      </w:pPr>
+    </w:p>
+    <w:p>
+      <w:pPr>
+        <w:pStyle w:val="ListParagraph"/>
+        <w:numPr>
+          <w:ilvl w:val="0"/>
+          <w:numId w:val="9"/>
+        </w:numPr>
+        <w:rPr>
+          <w:b/>
+          <w:bCs/>
+        </w:rPr>
+      </w:pPr>
+      <w:r>
+        <w:rPr>
+          <w:b/>
+          <w:bCs/>
+        </w:rPr>
+        <w:t>Victor Filpo</w:t>
+      </w:r>
+    </w:p>
+    <w:p>
+      <w:pPr>
+        <w:pStyle w:val="ListParagraph"/>
+        <w:numPr>
+          <w:ilvl w:val="0"/>
+          <w:numId w:val="9"/>
+        </w:numPr>
+        <w:rPr>
+          <w:b/>
+          <w:bCs/>
+        </w:rPr>
+      </w:pPr>
+      <w:r>
+        <w:rPr>
+          <w:b/>
+          <w:bCs/>
+        </w:rPr>
+        <w:t>VF - Food request handler unit test coverage</w:t>
+      </w:r>
+    </w:p>
+    <w:p>
+      <w:pPr>
+        <w:pStyle w:val="ListParagraph"/>
+        <w:numPr>
+          <w:ilvl w:val="0"/>
+          <w:numId w:val="9"/>
+        </w:numPr>
+        <w:rPr>
+          <w:b/>
+          <w:bCs/>
+        </w:rPr>
+      </w:pPr>
+      <w:r>
+        <w:rPr>
+          <w:b/>
+          <w:bCs/>
+        </w:rPr>
+        <w:t>Generate list of test cases that I should write, so I make sure to hit coverage goals</w:t>
+      </w:r>
+    </w:p>
+    <w:p>
+      <w:pPr>
+        <w:pStyle w:val="ListParagraph"/>
+        <w:numPr>
+          <w:ilvl w:val="0"/>
+          <w:numId w:val="9"/>
+        </w:numPr>
+        <w:rPr>
+          <w:b/>
+          <w:bCs/>
+        </w:rPr>
+      </w:pPr>
+      <w:r>
+        <w:rPr>
+          <w:b/>
+          <w:bCs/>
+        </w:rPr>
+        <w:t>00b705706e58e1061de398045c94b14f036f894d</w:t>
+      </w:r>
+    </w:p>
+    <w:p>
+      <w:pPr>
+        <w:rPr>
+          <w:b/>
+          <w:bCs/>
+        </w:rPr>
+      </w:pPr>
+    </w:p>
+    <w:p>
+      <w:pPr>
+        <w:rPr>
+          <w:b/>
+          <w:bCs/>
+        </w:rPr>
+      </w:pPr>
+      <w:r>
+        <w:rPr>
+          <w:b/>
+          <w:bCs/>
+        </w:rPr>
+        <w:t>1.</w:t>
+      </w:r>
+      <w:r>
+        <w:rPr>
+          <w:b/>
+          <w:bCs/>
+        </w:rPr>
+        <w:tab/>
+        <w:t>Victor Filpo</w:t>
+      </w:r>
+    </w:p>
+    <w:p>
+      <w:pPr>
+        <w:rPr>
+          <w:b/>
+          <w:bCs/>
+        </w:rPr>
+      </w:pPr>
+      <w:r>
+        <w:rPr>
+          <w:b/>
+          <w:bCs/>
+        </w:rPr>
+        <w:t>2.</w:t>
+      </w:r>
+      <w:r>
+        <w:rPr>
+          <w:b/>
+          <w:bCs/>
+        </w:rPr>
+        <w:tab/>
+      </w:r>
+      <w:r>
+        <w:rPr>
+          <w:b/>
+          <w:bCs/>
+        </w:rPr>
+        <w:t>VF - Persistent user session in nutrition tracker</w:t>
+      </w:r>
+    </w:p>
+    <w:p>
+      <w:pPr>
+        <w:rPr>
+          <w:b/>
+          <w:bCs/>
+        </w:rPr>
+      </w:pPr>
+      <w:r>
+        <w:rPr>
+          <w:b/>
+          <w:bCs/>
+        </w:rPr>
+        <w:t>3.</w:t>
+      </w:r>
+      <w:r>
+        <w:rPr>
+          <w:b/>
+          <w:bCs/>
+        </w:rPr>
+        <w:tab/>
+      </w:r>
+      <w:r>
+        <w:rPr>
+          <w:b/>
+          <w:bCs/>
+        </w:rPr>
+        <w:t>Bugfixes, structuring a persistent user session throughout the system, while following MVVM pattern</w:t>
+      </w:r>
+    </w:p>
+    <w:p>
+      <w:pPr>
+        <w:rPr>
+          <w:b/>
+          <w:bCs/>
+        </w:rPr>
+      </w:pPr>
+      <w:r>
+        <w:rPr>
+          <w:b/>
+          <w:bCs/>
+        </w:rPr>
+        <w:t>4.</w:t>
+      </w:r>
+      <w:r>
+        <w:rPr>
+          <w:b/>
+          <w:bCs/>
+        </w:rPr>
+        <w:tab/>
+      </w:r>
+      <w:r>
+        <w:rPr>
+          <w:b/>
+          <w:bCs/>
+        </w:rPr>
+        <w:t>fe2bb1ba01b989044352c7c3751390ae77671eee</w:t>
       </w:r>
     </w:p>
     <w:p>
@@ -3508,6 +3844,184 @@
     </w:lvl>
   </w:abstractNum>
   <w:abstractNum w:abstractNumId="2" w15:restartNumberingAfterBreak="0">
+    <w:nsid w:val="42626332"/>
+    <w:multiLevelType w:val="hybridMultilevel"/>
+    <w:tmpl w:val="E460E91E"/>
+    <w:lvl w:ilvl="0" w:tplc="0409000F">
+      <w:start w:val="1"/>
+      <w:numFmt w:val="decimal"/>
+      <w:lvlText w:val="%1."/>
+      <w:lvlJc w:val="left"/>
+      <w:pPr>
+        <w:ind w:left="720" w:hanging="360"/>
+      </w:pPr>
+      <w:rPr>
+        <w:rFonts w:hint="default"/>
+      </w:rPr>
+    </w:lvl>
+    <w:lvl w:ilvl="1" w:tplc="04090019" w:tentative="1">
+      <w:start w:val="1"/>
+      <w:numFmt w:val="lowerLetter"/>
+      <w:lvlText w:val="%2."/>
+      <w:lvlJc w:val="left"/>
+      <w:pPr>
+        <w:ind w:left="1440" w:hanging="360"/>
+      </w:pPr>
+    </w:lvl>
+    <w:lvl w:ilvl="2" w:tplc="0409001B" w:tentative="1">
+      <w:start w:val="1"/>
+      <w:numFmt w:val="lowerRoman"/>
+      <w:lvlText w:val="%3."/>
+      <w:lvlJc w:val="right"/>
+      <w:pPr>
+        <w:ind w:left="2160" w:hanging="180"/>
+      </w:pPr>
+    </w:lvl>
+    <w:lvl w:ilvl="3" w:tplc="0409000F" w:tentative="1">
+      <w:start w:val="1"/>
+      <w:numFmt w:val="decimal"/>
+      <w:lvlText w:val="%4."/>
+      <w:lvlJc w:val="left"/>
+      <w:pPr>
+        <w:ind w:left="2880" w:hanging="360"/>
+      </w:pPr>
+    </w:lvl>
+    <w:lvl w:ilvl="4" w:tplc="04090019" w:tentative="1">
+      <w:start w:val="1"/>
+      <w:numFmt w:val="lowerLetter"/>
+      <w:lvlText w:val="%5."/>
+      <w:lvlJc w:val="left"/>
+      <w:pPr>
+        <w:ind w:left="3600" w:hanging="360"/>
+      </w:pPr>
+    </w:lvl>
+    <w:lvl w:ilvl="5" w:tplc="0409001B" w:tentative="1">
+      <w:start w:val="1"/>
+      <w:numFmt w:val="lowerRoman"/>
+      <w:lvlText w:val="%6."/>
+      <w:lvlJc w:val="right"/>
+      <w:pPr>
+        <w:ind w:left="4320" w:hanging="180"/>
+      </w:pPr>
+    </w:lvl>
+    <w:lvl w:ilvl="6" w:tplc="0409000F" w:tentative="1">
+      <w:start w:val="1"/>
+      <w:numFmt w:val="decimal"/>
+      <w:lvlText w:val="%7."/>
+      <w:lvlJc w:val="left"/>
+      <w:pPr>
+        <w:ind w:left="5040" w:hanging="360"/>
+      </w:pPr>
+    </w:lvl>
+    <w:lvl w:ilvl="7" w:tplc="04090019" w:tentative="1">
+      <w:start w:val="1"/>
+      <w:numFmt w:val="lowerLetter"/>
+      <w:lvlText w:val="%8."/>
+      <w:lvlJc w:val="left"/>
+      <w:pPr>
+        <w:ind w:left="5760" w:hanging="360"/>
+      </w:pPr>
+    </w:lvl>
+    <w:lvl w:ilvl="8" w:tplc="0409001B" w:tentative="1">
+      <w:start w:val="1"/>
+      <w:numFmt w:val="lowerRoman"/>
+      <w:lvlText w:val="%9."/>
+      <w:lvlJc w:val="right"/>
+      <w:pPr>
+        <w:ind w:left="6480" w:hanging="180"/>
+      </w:pPr>
+    </w:lvl>
+  </w:abstractNum>
+  <w:abstractNum w:abstractNumId="3" w15:restartNumberingAfterBreak="0">
+    <w:nsid w:val="58DE14B0"/>
+    <w:multiLevelType w:val="hybridMultilevel"/>
+    <w:tmpl w:val="62C6A376"/>
+    <w:lvl w:ilvl="0" w:tplc="0409000F">
+      <w:start w:val="1"/>
+      <w:numFmt w:val="decimal"/>
+      <w:lvlText w:val="%1."/>
+      <w:lvlJc w:val="left"/>
+      <w:pPr>
+        <w:ind w:left="720" w:hanging="360"/>
+      </w:pPr>
+      <w:rPr>
+        <w:rFonts w:hint="default"/>
+      </w:rPr>
+    </w:lvl>
+    <w:lvl w:ilvl="1" w:tplc="04090019" w:tentative="1">
+      <w:start w:val="1"/>
+      <w:numFmt w:val="lowerLetter"/>
+      <w:lvlText w:val="%2."/>
+      <w:lvlJc w:val="left"/>
+      <w:pPr>
+        <w:ind w:left="1440" w:hanging="360"/>
+      </w:pPr>
+    </w:lvl>
+    <w:lvl w:ilvl="2" w:tplc="0409001B" w:tentative="1">
+      <w:start w:val="1"/>
+      <w:numFmt w:val="lowerRoman"/>
+      <w:lvlText w:val="%3."/>
+      <w:lvlJc w:val="right"/>
+      <w:pPr>
+        <w:ind w:left="2160" w:hanging="180"/>
+      </w:pPr>
+    </w:lvl>
+    <w:lvl w:ilvl="3" w:tplc="0409000F" w:tentative="1">
+      <w:start w:val="1"/>
+      <w:numFmt w:val="decimal"/>
+      <w:lvlText w:val="%4."/>
+      <w:lvlJc w:val="left"/>
+      <w:pPr>
+        <w:ind w:left="2880" w:hanging="360"/>
+      </w:pPr>
+    </w:lvl>
+    <w:lvl w:ilvl="4" w:tplc="04090019" w:tentative="1">
+      <w:start w:val="1"/>
+      <w:numFmt w:val="lowerLetter"/>
+      <w:lvlText w:val="%5."/>
+      <w:lvlJc w:val="left"/>
+      <w:pPr>
+        <w:ind w:left="3600" w:hanging="360"/>
+      </w:pPr>
+    </w:lvl>
+    <w:lvl w:ilvl="5" w:tplc="0409001B" w:tentative="1">
+      <w:start w:val="1"/>
+      <w:numFmt w:val="lowerRoman"/>
+      <w:lvlText w:val="%6."/>
+      <w:lvlJc w:val="right"/>
+      <w:pPr>
+        <w:ind w:left="4320" w:hanging="180"/>
+      </w:pPr>
+    </w:lvl>
+    <w:lvl w:ilvl="6" w:tplc="0409000F" w:tentative="1">
+      <w:start w:val="1"/>
+      <w:numFmt w:val="decimal"/>
+      <w:lvlText w:val="%7."/>
+      <w:lvlJc w:val="left"/>
+      <w:pPr>
+        <w:ind w:left="5040" w:hanging="360"/>
+      </w:pPr>
+    </w:lvl>
+    <w:lvl w:ilvl="7" w:tplc="04090019" w:tentative="1">
+      <w:start w:val="1"/>
+      <w:numFmt w:val="lowerLetter"/>
+      <w:lvlText w:val="%8."/>
+      <w:lvlJc w:val="left"/>
+      <w:pPr>
+        <w:ind w:left="5760" w:hanging="360"/>
+      </w:pPr>
+    </w:lvl>
+    <w:lvl w:ilvl="8" w:tplc="0409001B" w:tentative="1">
+      <w:start w:val="1"/>
+      <w:numFmt w:val="lowerRoman"/>
+      <w:lvlText w:val="%9."/>
+      <w:lvlJc w:val="right"/>
+      <w:pPr>
+        <w:ind w:left="6480" w:hanging="180"/>
+      </w:pPr>
+    </w:lvl>
+  </w:abstractNum>
+  <w:abstractNum w:abstractNumId="4" w15:restartNumberingAfterBreak="0">
     <w:nsid w:val="5BD5494F"/>
     <w:multiLevelType w:val="hybridMultilevel"/>
     <w:tmpl w:val="1DD6E0B2"/>
@@ -3620,7 +4134,7 @@
       </w:rPr>
     </w:lvl>
   </w:abstractNum>
-  <w:abstractNum w:abstractNumId="3" w15:restartNumberingAfterBreak="0">
+  <w:abstractNum w:abstractNumId="5" w15:restartNumberingAfterBreak="0">
     <w:nsid w:val="5C6E3A02"/>
     <w:multiLevelType w:val="hybridMultilevel"/>
     <w:tmpl w:val="472E1434"/>
@@ -3709,7 +4223,96 @@
       </w:pPr>
     </w:lvl>
   </w:abstractNum>
-  <w:abstractNum w:abstractNumId="4" w15:restartNumberingAfterBreak="0">
+  <w:abstractNum w:abstractNumId="6" w15:restartNumberingAfterBreak="0">
+    <w:nsid w:val="6A4933D0"/>
+    <w:multiLevelType w:val="hybridMultilevel"/>
+    <w:tmpl w:val="03C27A9A"/>
+    <w:lvl w:ilvl="0" w:tplc="0409000F">
+      <w:start w:val="1"/>
+      <w:numFmt w:val="decimal"/>
+      <w:lvlText w:val="%1."/>
+      <w:lvlJc w:val="left"/>
+      <w:pPr>
+        <w:ind w:left="720" w:hanging="360"/>
+      </w:pPr>
+      <w:rPr>
+        <w:rFonts w:hint="default"/>
+      </w:rPr>
+    </w:lvl>
+    <w:lvl w:ilvl="1" w:tplc="04090019" w:tentative="1">
+      <w:start w:val="1"/>
+      <w:numFmt w:val="lowerLetter"/>
+      <w:lvlText w:val="%2."/>
+      <w:lvlJc w:val="left"/>
+      <w:pPr>
+        <w:ind w:left="1440" w:hanging="360"/>
+      </w:pPr>
+    </w:lvl>
+    <w:lvl w:ilvl="2" w:tplc="0409001B" w:tentative="1">
+      <w:start w:val="1"/>
+      <w:numFmt w:val="lowerRoman"/>
+      <w:lvlText w:val="%3."/>
+      <w:lvlJc w:val="right"/>
+      <w:pPr>
+        <w:ind w:left="2160" w:hanging="180"/>
+      </w:pPr>
+    </w:lvl>
+    <w:lvl w:ilvl="3" w:tplc="0409000F" w:tentative="1">
+      <w:start w:val="1"/>
+      <w:numFmt w:val="decimal"/>
+      <w:lvlText w:val="%4."/>
+      <w:lvlJc w:val="left"/>
+      <w:pPr>
+        <w:ind w:left="2880" w:hanging="360"/>
+      </w:pPr>
+    </w:lvl>
+    <w:lvl w:ilvl="4" w:tplc="04090019" w:tentative="1">
+      <w:start w:val="1"/>
+      <w:numFmt w:val="lowerLetter"/>
+      <w:lvlText w:val="%5."/>
+      <w:lvlJc w:val="left"/>
+      <w:pPr>
+        <w:ind w:left="3600" w:hanging="360"/>
+      </w:pPr>
+    </w:lvl>
+    <w:lvl w:ilvl="5" w:tplc="0409001B" w:tentative="1">
+      <w:start w:val="1"/>
+      <w:numFmt w:val="lowerRoman"/>
+      <w:lvlText w:val="%6."/>
+      <w:lvlJc w:val="right"/>
+      <w:pPr>
+        <w:ind w:left="4320" w:hanging="180"/>
+      </w:pPr>
+    </w:lvl>
+    <w:lvl w:ilvl="6" w:tplc="0409000F" w:tentative="1">
+      <w:start w:val="1"/>
+      <w:numFmt w:val="decimal"/>
+      <w:lvlText w:val="%7."/>
+      <w:lvlJc w:val="left"/>
+      <w:pPr>
+        <w:ind w:left="5040" w:hanging="360"/>
+      </w:pPr>
+    </w:lvl>
+    <w:lvl w:ilvl="7" w:tplc="04090019" w:tentative="1">
+      <w:start w:val="1"/>
+      <w:numFmt w:val="lowerLetter"/>
+      <w:lvlText w:val="%8."/>
+      <w:lvlJc w:val="left"/>
+      <w:pPr>
+        <w:ind w:left="5760" w:hanging="360"/>
+      </w:pPr>
+    </w:lvl>
+    <w:lvl w:ilvl="8" w:tplc="0409001B" w:tentative="1">
+      <w:start w:val="1"/>
+      <w:numFmt w:val="lowerRoman"/>
+      <w:lvlText w:val="%9."/>
+      <w:lvlJc w:val="right"/>
+      <w:pPr>
+        <w:ind w:left="6480" w:hanging="180"/>
+      </w:pPr>
+    </w:lvl>
+  </w:abstractNum>
+  <w:abstractNum w:abstractNumId="7" w15:restartNumberingAfterBreak="0">
     <w:nsid w:val="73490412"/>
     <w:multiLevelType w:val="hybridMultilevel"/>
     <w:tmpl w:val="C13246B0"/>
@@ -3795,7 +4398,7 @@
       </w:pPr>
     </w:lvl>
   </w:abstractNum>
-  <w:abstractNum w:abstractNumId="5" w15:restartNumberingAfterBreak="0">
+  <w:abstractNum w:abstractNumId="8" w15:restartNumberingAfterBreak="0">
     <w:nsid w:val="7688157B"/>
     <w:multiLevelType w:val="hybridMultilevel"/>
     <w:tmpl w:val="6E4A939E"/>
@@ -3885,22 +4488,31 @@
     </w:lvl>
   </w:abstractNum>
   <w:num w:numId="1" w16cid:durableId="1314723760">
-    <w:abstractNumId w:val="2"/>
+    <w:abstractNumId w:val="4"/>
   </w:num>
   <w:num w:numId="2" w16cid:durableId="611401654">
     <w:abstractNumId w:val="1"/>
   </w:num>
   <w:num w:numId="3" w16cid:durableId="479267999">
-    <w:abstractNumId w:val="4"/>
+    <w:abstractNumId w:val="7"/>
   </w:num>
   <w:num w:numId="4" w16cid:durableId="602810082">
     <w:abstractNumId w:val="0"/>
   </w:num>
   <w:num w:numId="5" w16cid:durableId="110560326">
+    <w:abstractNumId w:val="5"/>
+  </w:num>
+  <w:num w:numId="6" w16cid:durableId="311720692">
+    <w:abstractNumId w:val="8"/>
+  </w:num>
+  <w:num w:numId="7" w16cid:durableId="583296279">
+    <w:abstractNumId w:val="2"/>
+  </w:num>
+  <w:num w:numId="8" w16cid:durableId="23025807">
     <w:abstractNumId w:val="3"/>
   </w:num>
-  <w:num w:numId="6" w16cid:durableId="311720692">
-    <w:abstractNumId w:val="5"/>
+  <w:num w:numId="9" w16cid:durableId="1914195839">
+    <w:abstractNumId w:val="6"/>
   </w:num>
 </w:numbering>
 </file>
@@ -4330,6 +4942,7 @@
   <w:style w:type="character" w:default="1" w:styleId="DefaultParagraphFont">
     <w:name w:val="Default Paragraph Font"/>
     <w:uiPriority w:val="1"/>
+    <w:semiHidden/>
     <w:unhideWhenUsed/>
   </w:style>
   <w:style w:type="table" w:default="1" w:styleId="TableNormal">

</xml_diff>

<commit_message>
Added my parts to the sprint retrospective for sprint 2
</commit_message>
<xml_diff>
--- a/sprints/sprint2/Sprint Retrospective/Sprint Retrospective Report.docx
+++ b/sprints/sprint2/Sprint Retrospective/Sprint Retrospective Report.docx
@@ -21,7 +21,13 @@
         <w:t>Date Submitted:</w:t>
       </w:r>
       <w:r>
-        <w:t>4/ /26</w:t>
+        <w:t>4/</w:t>
+      </w:r>
+      <w:r>
+        <w:t>11</w:t>
+      </w:r>
+      <w:r>
+        <w:t>/26</w:t>
       </w:r>
     </w:p>
     <w:p>
@@ -217,23 +223,7 @@
                 <w:b/>
                 <w:bCs/>
               </w:rPr>
-              <w:t xml:space="preserve">Comments (e.g., reasons why </w:t>
-            </w:r>
-            <w:proofErr w:type="gramStart"/>
-            <w:r>
-              <w:rPr>
-                <w:b/>
-                <w:bCs/>
-              </w:rPr>
-              <w:t>feature is</w:t>
-            </w:r>
-            <w:proofErr w:type="gramEnd"/>
-            <w:r>
-              <w:rPr>
-                <w:b/>
-                <w:bCs/>
-              </w:rPr>
-              <w:t xml:space="preserve"> incomplete)</w:t>
+              <w:t>Comments (e.g., reasons why feature is incomplete)</w:t>
             </w:r>
           </w:p>
         </w:tc>
@@ -250,23 +240,7 @@
                 <w:rFonts w:ascii="Calibri" w:hAnsi="Calibri" w:cs="Calibri"/>
                 <w:color w:val="000000"/>
               </w:rPr>
-              <w:t xml:space="preserve">Communication </w:t>
-            </w:r>
-            <w:proofErr w:type="spellStart"/>
-            <w:r>
-              <w:rPr>
-                <w:rFonts w:ascii="Calibri" w:hAnsi="Calibri" w:cs="Calibri"/>
-                <w:color w:val="000000"/>
-              </w:rPr>
-              <w:t>Protecol</w:t>
-            </w:r>
-            <w:proofErr w:type="spellEnd"/>
-            <w:r>
-              <w:rPr>
-                <w:rFonts w:ascii="Calibri" w:hAnsi="Calibri" w:cs="Calibri"/>
-                <w:color w:val="000000"/>
-              </w:rPr>
-              <w:t xml:space="preserve"> for authorization process</w:t>
+              <w:t>Communication Protecol for authorization process</w:t>
             </w:r>
           </w:p>
         </w:tc>
@@ -561,17 +535,8 @@
                 <w:rFonts w:ascii="Calibri" w:hAnsi="Calibri" w:cs="Calibri"/>
                 <w:color w:val="000000"/>
               </w:rPr>
-              <w:t xml:space="preserve">Login Page </w:t>
-            </w:r>
-            <w:proofErr w:type="spellStart"/>
-            <w:r>
-              <w:rPr>
-                <w:rFonts w:ascii="Calibri" w:hAnsi="Calibri" w:cs="Calibri"/>
-                <w:color w:val="000000"/>
-              </w:rPr>
-              <w:t>Codebehind</w:t>
-            </w:r>
-            <w:proofErr w:type="spellEnd"/>
+              <w:t>Login Page Codebehind</w:t>
+            </w:r>
           </w:p>
         </w:tc>
         <w:tc>
@@ -618,23 +583,7 @@
                 <w:rFonts w:ascii="Calibri" w:hAnsi="Calibri" w:cs="Calibri"/>
                 <w:color w:val="000000"/>
               </w:rPr>
-              <w:t xml:space="preserve">Communication </w:t>
-            </w:r>
-            <w:proofErr w:type="spellStart"/>
-            <w:r>
-              <w:rPr>
-                <w:rFonts w:ascii="Calibri" w:hAnsi="Calibri" w:cs="Calibri"/>
-                <w:color w:val="000000"/>
-              </w:rPr>
-              <w:t>Protecol</w:t>
-            </w:r>
-            <w:proofErr w:type="spellEnd"/>
-            <w:r>
-              <w:rPr>
-                <w:rFonts w:ascii="Calibri" w:hAnsi="Calibri" w:cs="Calibri"/>
-                <w:color w:val="000000"/>
-              </w:rPr>
-              <w:t xml:space="preserve"> for Create Account</w:t>
+              <w:t>Communication Protecol for Create Account</w:t>
             </w:r>
           </w:p>
         </w:tc>
@@ -887,23 +836,7 @@
                 <w:rFonts w:ascii="Calibri" w:hAnsi="Calibri" w:cs="Calibri"/>
                 <w:color w:val="000000"/>
               </w:rPr>
-              <w:t xml:space="preserve">Communication </w:t>
-            </w:r>
-            <w:proofErr w:type="spellStart"/>
-            <w:r>
-              <w:rPr>
-                <w:rFonts w:ascii="Calibri" w:hAnsi="Calibri" w:cs="Calibri"/>
-                <w:color w:val="000000"/>
-              </w:rPr>
-              <w:t>Protecol</w:t>
-            </w:r>
-            <w:proofErr w:type="spellEnd"/>
-            <w:r>
-              <w:rPr>
-                <w:rFonts w:ascii="Calibri" w:hAnsi="Calibri" w:cs="Calibri"/>
-                <w:color w:val="000000"/>
-              </w:rPr>
-              <w:t xml:space="preserve"> for Create Food</w:t>
+              <w:t>Communication Protecol for Create Food</w:t>
             </w:r>
           </w:p>
         </w:tc>
@@ -1053,23 +986,7 @@
                 <w:rFonts w:ascii="Calibri" w:hAnsi="Calibri" w:cs="Calibri"/>
                 <w:color w:val="000000"/>
               </w:rPr>
-              <w:t xml:space="preserve">Communication </w:t>
-            </w:r>
-            <w:proofErr w:type="spellStart"/>
-            <w:r>
-              <w:rPr>
-                <w:rFonts w:ascii="Calibri" w:hAnsi="Calibri" w:cs="Calibri"/>
-                <w:color w:val="000000"/>
-              </w:rPr>
-              <w:t>Protecol</w:t>
-            </w:r>
-            <w:proofErr w:type="spellEnd"/>
-            <w:r>
-              <w:rPr>
-                <w:rFonts w:ascii="Calibri" w:hAnsi="Calibri" w:cs="Calibri"/>
-                <w:color w:val="000000"/>
-              </w:rPr>
-              <w:t xml:space="preserve"> for Search</w:t>
+              <w:t>Communication Protecol for Search</w:t>
             </w:r>
           </w:p>
         </w:tc>
@@ -1123,33 +1040,8 @@
                 <w:rFonts w:ascii="Calibri" w:hAnsi="Calibri" w:cs="Calibri"/>
                 <w:color w:val="000000"/>
               </w:rPr>
-              <w:t xml:space="preserve">Communication </w:t>
-            </w:r>
-            <w:proofErr w:type="spellStart"/>
-            <w:r>
-              <w:rPr>
-                <w:rFonts w:ascii="Calibri" w:hAnsi="Calibri" w:cs="Calibri"/>
-                <w:color w:val="000000"/>
-              </w:rPr>
-              <w:t>Protecol</w:t>
-            </w:r>
-            <w:proofErr w:type="spellEnd"/>
-            <w:r>
-              <w:rPr>
-                <w:rFonts w:ascii="Calibri" w:hAnsi="Calibri" w:cs="Calibri"/>
-                <w:color w:val="000000"/>
-              </w:rPr>
-              <w:t xml:space="preserve"> for Update </w:t>
-            </w:r>
-            <w:proofErr w:type="spellStart"/>
-            <w:r>
-              <w:rPr>
-                <w:rFonts w:ascii="Calibri" w:hAnsi="Calibri" w:cs="Calibri"/>
-                <w:color w:val="000000"/>
-              </w:rPr>
-              <w:t>FoodLog</w:t>
-            </w:r>
-            <w:proofErr w:type="spellEnd"/>
+              <w:t>Communication Protecol for Update FoodLog</w:t>
+            </w:r>
           </w:p>
         </w:tc>
         <w:tc>
@@ -1197,21 +1089,12 @@
             <w:vAlign w:val="bottom"/>
           </w:tcPr>
           <w:p>
-            <w:proofErr w:type="spellStart"/>
-            <w:r>
-              <w:rPr>
-                <w:rFonts w:ascii="Calibri" w:hAnsi="Calibri" w:cs="Calibri"/>
-                <w:color w:val="000000"/>
-              </w:rPr>
-              <w:t>FoodLog</w:t>
-            </w:r>
-            <w:proofErr w:type="spellEnd"/>
-            <w:r>
-              <w:rPr>
-                <w:rFonts w:ascii="Calibri" w:hAnsi="Calibri" w:cs="Calibri"/>
-                <w:color w:val="000000"/>
-              </w:rPr>
-              <w:t xml:space="preserve"> Structure</w:t>
+            <w:r>
+              <w:rPr>
+                <w:rFonts w:ascii="Calibri" w:hAnsi="Calibri" w:cs="Calibri"/>
+                <w:color w:val="000000"/>
+              </w:rPr>
+              <w:t>FoodLog Structure</w:t>
             </w:r>
           </w:p>
         </w:tc>
@@ -1342,7 +1225,11 @@
           <w:tcPr>
             <w:tcW w:w="2316" w:type="dxa"/>
           </w:tcPr>
-          <w:p/>
+          <w:p>
+            <w:r>
+              <w:t>Task was moved to next sprint / Not started due to illness</w:t>
+            </w:r>
+          </w:p>
         </w:tc>
       </w:tr>
       <w:tr>
@@ -1392,10 +1279,7 @@
           </w:tcPr>
           <w:p>
             <w:r>
-              <w:t xml:space="preserve">Task was </w:t>
-            </w:r>
-            <w:r>
-              <w:t>moved to next sprint</w:t>
+              <w:t>Task was moved to next sprint</w:t>
             </w:r>
           </w:p>
         </w:tc>
@@ -1508,23 +1392,8 @@
                 <w:rFonts w:ascii="Calibri" w:hAnsi="Calibri" w:cs="Calibri"/>
                 <w:color w:val="000000"/>
               </w:rPr>
-              <w:t xml:space="preserve">Update </w:t>
-            </w:r>
-            <w:proofErr w:type="spellStart"/>
-            <w:r>
-              <w:rPr>
-                <w:rFonts w:ascii="Calibri" w:hAnsi="Calibri" w:cs="Calibri"/>
-                <w:color w:val="000000"/>
-              </w:rPr>
-              <w:t>DayOfFood</w:t>
-            </w:r>
-            <w:proofErr w:type="spellEnd"/>
-            <w:r>
-              <w:rPr>
-                <w:rFonts w:ascii="Calibri" w:hAnsi="Calibri" w:cs="Calibri"/>
-                <w:color w:val="000000"/>
-              </w:rPr>
-              <w:t xml:space="preserve"> Process Client Side</w:t>
+              <w:lastRenderedPageBreak/>
+              <w:t>Update DayOfFood Process Client Side</w:t>
             </w:r>
           </w:p>
         </w:tc>
@@ -1563,7 +1432,11 @@
           <w:tcPr>
             <w:tcW w:w="2316" w:type="dxa"/>
           </w:tcPr>
-          <w:p/>
+          <w:p>
+            <w:r>
+              <w:t>Task was moved to next sprint / Not started due to illness</w:t>
+            </w:r>
+          </w:p>
         </w:tc>
       </w:tr>
       <w:tr>
@@ -1578,23 +1451,7 @@
                 <w:rFonts w:ascii="Calibri" w:hAnsi="Calibri" w:cs="Calibri"/>
                 <w:color w:val="000000"/>
               </w:rPr>
-              <w:t xml:space="preserve">Update </w:t>
-            </w:r>
-            <w:proofErr w:type="spellStart"/>
-            <w:r>
-              <w:rPr>
-                <w:rFonts w:ascii="Calibri" w:hAnsi="Calibri" w:cs="Calibri"/>
-                <w:color w:val="000000"/>
-              </w:rPr>
-              <w:t>DayOfFood</w:t>
-            </w:r>
-            <w:proofErr w:type="spellEnd"/>
-            <w:r>
-              <w:rPr>
-                <w:rFonts w:ascii="Calibri" w:hAnsi="Calibri" w:cs="Calibri"/>
-                <w:color w:val="000000"/>
-              </w:rPr>
-              <w:t xml:space="preserve"> Process Server Side</w:t>
+              <w:t>Update DayOfFood Process Server Side</w:t>
             </w:r>
           </w:p>
         </w:tc>
@@ -1642,24 +1499,7 @@
                 <w:rFonts w:ascii="Calibri" w:hAnsi="Calibri" w:cs="Calibri"/>
                 <w:color w:val="000000"/>
               </w:rPr>
-              <w:lastRenderedPageBreak/>
-              <w:t xml:space="preserve">Communication </w:t>
-            </w:r>
-            <w:proofErr w:type="spellStart"/>
-            <w:r>
-              <w:rPr>
-                <w:rFonts w:ascii="Calibri" w:hAnsi="Calibri" w:cs="Calibri"/>
-                <w:color w:val="000000"/>
-              </w:rPr>
-              <w:t>Protecol</w:t>
-            </w:r>
-            <w:proofErr w:type="spellEnd"/>
-            <w:r>
-              <w:rPr>
-                <w:rFonts w:ascii="Calibri" w:hAnsi="Calibri" w:cs="Calibri"/>
-                <w:color w:val="000000"/>
-              </w:rPr>
-              <w:t xml:space="preserve"> for Update Diet</w:t>
+              <w:t>Communication Protecol for Update Diet</w:t>
             </w:r>
           </w:p>
         </w:tc>
@@ -1746,7 +1586,11 @@
           <w:tcPr>
             <w:tcW w:w="2316" w:type="dxa"/>
           </w:tcPr>
-          <w:p/>
+          <w:p>
+            <w:r>
+              <w:t>Illness</w:t>
+            </w:r>
+          </w:p>
         </w:tc>
       </w:tr>
       <w:tr>
@@ -1853,7 +1697,11 @@
           <w:tcPr>
             <w:tcW w:w="2316" w:type="dxa"/>
           </w:tcPr>
-          <w:p/>
+          <w:p>
+            <w:r>
+              <w:t>Task was moved to next sprint / Not started due to illness</w:t>
+            </w:r>
+          </w:p>
         </w:tc>
       </w:tr>
       <w:tr>
@@ -1906,7 +1754,11 @@
           <w:tcPr>
             <w:tcW w:w="2316" w:type="dxa"/>
           </w:tcPr>
-          <w:p/>
+          <w:p>
+            <w:r>
+              <w:t>Task was moved to next sprint / Not started due to illness</w:t>
+            </w:r>
+          </w:p>
         </w:tc>
       </w:tr>
       <w:tr>
@@ -1927,17 +1779,8 @@
                 <w:rFonts w:ascii="Calibri" w:hAnsi="Calibri" w:cs="Calibri"/>
                 <w:color w:val="000000"/>
               </w:rPr>
-              <w:t xml:space="preserve">Edit Diet </w:t>
-            </w:r>
-            <w:proofErr w:type="spellStart"/>
-            <w:r>
-              <w:rPr>
-                <w:rFonts w:ascii="Calibri" w:hAnsi="Calibri" w:cs="Calibri"/>
-                <w:color w:val="000000"/>
-              </w:rPr>
-              <w:t>Codebehind</w:t>
-            </w:r>
-            <w:proofErr w:type="spellEnd"/>
+              <w:t>Edit Diet Codebehind</w:t>
+            </w:r>
           </w:p>
         </w:tc>
         <w:tc>
@@ -2013,21 +1856,8 @@
           <w:numId w:val="1"/>
         </w:numPr>
       </w:pPr>
-      <w:proofErr w:type="gramStart"/>
-      <w:r>
-        <w:t>A git</w:t>
-      </w:r>
-      <w:proofErr w:type="gramEnd"/>
-      <w:r>
-        <w:t xml:space="preserve"> </w:t>
-      </w:r>
-      <w:proofErr w:type="gramStart"/>
-      <w:r>
-        <w:t>commit</w:t>
-      </w:r>
-      <w:proofErr w:type="gramEnd"/>
-      <w:r>
-        <w:t xml:space="preserve"> message</w:t>
+      <w:r>
+        <w:t>A git commit message</w:t>
       </w:r>
       <w:r>
         <w:t xml:space="preserve"> (please include the commit ID and date/time)</w:t>
@@ -2101,15 +1931,7 @@
         </w:numPr>
       </w:pPr>
       <w:r>
-        <w:t xml:space="preserve">providing </w:t>
-      </w:r>
-      <w:proofErr w:type="gramStart"/>
-      <w:r>
-        <w:t>detail</w:t>
-      </w:r>
-      <w:proofErr w:type="gramEnd"/>
-      <w:r>
-        <w:t xml:space="preserve"> as to how to reproduce a bug</w:t>
+        <w:t>providing detail as to how to reproduce a bug</w:t>
       </w:r>
     </w:p>
     <w:p>
@@ -2214,13 +2036,8 @@
               <w:t xml:space="preserve"> to </w:t>
             </w:r>
             <w:r>
-              <w:t>documentation-</w:t>
-            </w:r>
-            <w:proofErr w:type="spellStart"/>
-            <w:r>
-              <w:t>ClassDiagram</w:t>
-            </w:r>
-            <w:proofErr w:type="spellEnd"/>
+              <w:t>documentation-ClassDiagram</w:t>
+            </w:r>
             <w:r>
               <w:t xml:space="preserve"> branch</w:t>
             </w:r>
@@ -2234,13 +2051,8 @@
               <w:t>ontroller had some changes</w:t>
             </w:r>
             <w:r>
-              <w:t xml:space="preserve"> than the </w:t>
-            </w:r>
-            <w:proofErr w:type="gramStart"/>
-            <w:r>
-              <w:t>others</w:t>
-            </w:r>
-            <w:proofErr w:type="gramEnd"/>
+              <w:t xml:space="preserve"> than the others</w:t>
+            </w:r>
             <w:r>
               <w:t xml:space="preserve"> but </w:t>
             </w:r>
@@ -2271,21 +2083,8 @@
           <w:p/>
           <w:p>
             <w:r>
-              <w:t xml:space="preserve">    Merge pull request #47 from </w:t>
-            </w:r>
-            <w:proofErr w:type="spellStart"/>
-            <w:r>
-              <w:t>almanzayeni</w:t>
-            </w:r>
-            <w:proofErr w:type="spellEnd"/>
-            <w:r>
-              <w:t>/documentation-</w:t>
-            </w:r>
-            <w:proofErr w:type="spellStart"/>
-            <w:r>
-              <w:t>ClassDiagram</w:t>
-            </w:r>
-            <w:proofErr w:type="spellEnd"/>
+              <w:t>    Merge pull request #47 from almanzayeni/documentation-ClassDiagram</w:t>
+            </w:r>
           </w:p>
           <w:p>
             <w:r>
@@ -2335,19 +2134,12 @@
           <w:p/>
           <w:p>
             <w:r>
-              <w:t xml:space="preserve">    Add </w:t>
-            </w:r>
-            <w:proofErr w:type="gramStart"/>
-            <w:r>
-              <w:t>python</w:t>
-            </w:r>
-            <w:proofErr w:type="gramEnd"/>
-            <w:r>
-              <w:t xml:space="preserve"> class diagram</w:t>
-            </w:r>
-          </w:p>
-          <w:p>
-            <w:r>
+              <w:t>    Add python class diagram</w:t>
+            </w:r>
+          </w:p>
+          <w:p>
+            <w:r>
+              <w:lastRenderedPageBreak/>
               <w:t>    Started the python class diagram</w:t>
             </w:r>
           </w:p>
@@ -2361,6 +2153,7 @@
           </w:tcPr>
           <w:p>
             <w:r>
+              <w:lastRenderedPageBreak/>
               <w:t>Victor Filpo</w:t>
             </w:r>
           </w:p>
@@ -2393,31 +2186,7 @@
           </w:tcPr>
           <w:p>
             <w:r>
-              <w:t xml:space="preserve">Commit fe2bb1b 3/31/26 @7PM - </w:t>
-            </w:r>
-            <w:proofErr w:type="spellStart"/>
-            <w:r>
-              <w:t>DashBoard</w:t>
-            </w:r>
-            <w:proofErr w:type="spellEnd"/>
-            <w:r>
-              <w:t xml:space="preserve"> populates </w:t>
-            </w:r>
-            <w:proofErr w:type="gramStart"/>
-            <w:r>
-              <w:t>User name</w:t>
-            </w:r>
-            <w:proofErr w:type="gramEnd"/>
-            <w:r>
-              <w:t xml:space="preserve"> and </w:t>
-            </w:r>
-            <w:proofErr w:type="spellStart"/>
-            <w:r>
-              <w:t>FoodLog</w:t>
-            </w:r>
-            <w:proofErr w:type="spellEnd"/>
-            <w:r>
-              <w:t xml:space="preserve"> once logged in</w:t>
+              <w:t>Commit fe2bb1b 3/31/26 @7PM - DashBoard populates User name and FoodLog once logged in</w:t>
             </w:r>
           </w:p>
         </w:tc>
@@ -2466,44 +2235,11 @@
           </w:p>
           <w:p>
             <w:r>
-              <w:lastRenderedPageBreak/>
-              <w:t xml:space="preserve">No request type included response = </w:t>
-            </w:r>
-            <w:proofErr w:type="gramStart"/>
-            <w:r>
-              <w:t>status:-</w:t>
-            </w:r>
-            <w:proofErr w:type="gramEnd"/>
-            <w:r>
-              <w:t xml:space="preserve">1, </w:t>
-            </w:r>
-            <w:proofErr w:type="spellStart"/>
-            <w:r>
-              <w:t>failure_message:"no</w:t>
-            </w:r>
-            <w:proofErr w:type="spellEnd"/>
-            <w:r>
-              <w:t xml:space="preserve"> request type"</w:t>
+              <w:t>No request type included response = status:-1, failure_message:"no request type"</w:t>
             </w:r>
             <w:r>
               <w:br/>
-              <w:t xml:space="preserve">No matching request type response = </w:t>
-            </w:r>
-            <w:proofErr w:type="gramStart"/>
-            <w:r>
-              <w:t>status:-</w:t>
-            </w:r>
-            <w:proofErr w:type="gramEnd"/>
-            <w:r>
-              <w:t xml:space="preserve">1, </w:t>
-            </w:r>
-            <w:proofErr w:type="spellStart"/>
-            <w:r>
-              <w:t>failure_message:"unsupported</w:t>
-            </w:r>
-            <w:proofErr w:type="spellEnd"/>
-            <w:r>
-              <w:t xml:space="preserve"> request type"</w:t>
+              <w:t>No matching request type response = status:-1, failure_message:"unsupported request type"</w:t>
             </w:r>
           </w:p>
           <w:p>
@@ -2513,87 +2249,15 @@
           </w:p>
           <w:p>
             <w:r>
-              <w:t xml:space="preserve">AUTH request = </w:t>
-            </w:r>
-            <w:proofErr w:type="spellStart"/>
-            <w:r>
-              <w:t>request_type:AUTH</w:t>
-            </w:r>
-            <w:proofErr w:type="spellEnd"/>
-            <w:r>
-              <w:t xml:space="preserve">, </w:t>
-            </w:r>
-            <w:proofErr w:type="spellStart"/>
-            <w:r>
-              <w:t>username:test</w:t>
-            </w:r>
-            <w:proofErr w:type="spellEnd"/>
-            <w:r>
-              <w:t>, password:pass123</w:t>
+              <w:t>AUTH request = request_type:AUTH, username:test, password:pass123</w:t>
             </w:r>
             <w:r>
               <w:br/>
-              <w:t xml:space="preserve">Failed AUTH response = status:-1, </w:t>
-            </w:r>
-            <w:proofErr w:type="spellStart"/>
-            <w:r>
-              <w:t>failure_message:"invalid</w:t>
-            </w:r>
-            <w:proofErr w:type="spellEnd"/>
-            <w:r>
-              <w:t xml:space="preserve"> username or password"</w:t>
+              <w:t>Failed AUTH response = status:-1, failure_message:"invalid username or password"</w:t>
             </w:r>
             <w:r>
               <w:br/>
-              <w:t xml:space="preserve">Success AUTH response = status:1, </w:t>
-            </w:r>
-            <w:proofErr w:type="spellStart"/>
-            <w:r>
-              <w:t>name:John</w:t>
-            </w:r>
-            <w:proofErr w:type="spellEnd"/>
-            <w:r>
-              <w:t xml:space="preserve"> Doe, </w:t>
-            </w:r>
-            <w:proofErr w:type="spellStart"/>
-            <w:r>
-              <w:t>username:johndoe</w:t>
-            </w:r>
-            <w:proofErr w:type="spellEnd"/>
-            <w:r>
-              <w:t xml:space="preserve">, password:password123, </w:t>
-            </w:r>
-            <w:proofErr w:type="spellStart"/>
-            <w:r>
-              <w:t>foodLog</w:t>
-            </w:r>
-            <w:proofErr w:type="spellEnd"/>
-            <w:r>
-              <w:t xml:space="preserve">:[date:2026-03-11, breakfast:[...], lunch:[...], dinner:[...], snacks[...]], </w:t>
-            </w:r>
-            <w:proofErr w:type="spellStart"/>
-            <w:r>
-              <w:t>dietGoals</w:t>
-            </w:r>
-            <w:proofErr w:type="spellEnd"/>
-            <w:r>
-              <w:t>:[</w:t>
-            </w:r>
-            <w:proofErr w:type="spellStart"/>
-            <w:r>
-              <w:t>primaryGoal:CALORIE</w:t>
-            </w:r>
-            <w:proofErr w:type="spellEnd"/>
-            <w:r>
-              <w:t xml:space="preserve">, calorieGoal:5000, proteinGoal:50, fatGoal:10, sugarGoal:30, sodiumGoal:20, carbsGoal:13, </w:t>
-            </w:r>
-            <w:proofErr w:type="spellStart"/>
-            <w:r>
-              <w:t>otherGoals</w:t>
-            </w:r>
-            <w:proofErr w:type="spellEnd"/>
-            <w:r>
-              <w:t>:[...]]</w:t>
+              <w:t>Success AUTH response = status:1, name:John Doe, username:johndoe, password:password123, foodLog:[date:2026-03-11, breakfast:[...], lunch:[...], dinner:[...], snacks[...]], dietGoals:[primaryGoal:CALORIE, calorieGoal:5000, proteinGoal:50, fatGoal:10, sugarGoal:30, sodiumGoal:20, carbsGoal:13, otherGoals:[...]]</w:t>
             </w:r>
           </w:p>
           <w:p>
@@ -2624,44 +2288,12 @@
             </w:r>
             <w:r>
               <w:br/>
-            </w:r>
-            <w:proofErr w:type="spellStart"/>
-            <w:r>
-              <w:t>FoodLog</w:t>
-            </w:r>
-            <w:proofErr w:type="spellEnd"/>
-            <w:r>
-              <w:t xml:space="preserve"> </w:t>
-            </w:r>
-            <w:proofErr w:type="spellStart"/>
-            <w:r>
-              <w:t>currentFoodLog</w:t>
-            </w:r>
-            <w:proofErr w:type="spellEnd"/>
-            <w:r>
-              <w:t>;</w:t>
+              <w:t>FoodLog currentFoodLog;</w:t>
             </w:r>
             <w:r>
               <w:br/>
-            </w:r>
-            <w:proofErr w:type="spellStart"/>
-            <w:r>
-              <w:t>DietGoals</w:t>
-            </w:r>
-            <w:proofErr w:type="spellEnd"/>
-            <w:r>
-              <w:t xml:space="preserve"> </w:t>
-            </w:r>
-            <w:proofErr w:type="spellStart"/>
-            <w:proofErr w:type="gramStart"/>
-            <w:r>
-              <w:t>currentGoals</w:t>
-            </w:r>
-            <w:proofErr w:type="spellEnd"/>
-            <w:r>
-              <w:t>;</w:t>
-            </w:r>
-            <w:proofErr w:type="gramEnd"/>
+              <w:t>DietGoals currentGoals;</w:t>
+            </w:r>
           </w:p>
           <w:p>
             <w:r>
@@ -2669,13 +2301,8 @@
             </w:r>
           </w:p>
           <w:p>
-            <w:proofErr w:type="spellStart"/>
-            <w:r>
-              <w:t>FoodLog</w:t>
-            </w:r>
-            <w:proofErr w:type="spellEnd"/>
-            <w:r>
-              <w:t xml:space="preserve"> Class:</w:t>
+            <w:r>
+              <w:t>FoodLog Class:</w:t>
             </w:r>
             <w:r>
               <w:br/>
@@ -2683,51 +2310,19 @@
             </w:r>
             <w:r>
               <w:br/>
-              <w:t>List&lt;</w:t>
-            </w:r>
-            <w:proofErr w:type="spellStart"/>
-            <w:r>
-              <w:t>FoodItem</w:t>
-            </w:r>
-            <w:proofErr w:type="spellEnd"/>
-            <w:r>
-              <w:t>&gt; breakfast;</w:t>
+              <w:t>List&lt;FoodItem&gt; breakfast;</w:t>
             </w:r>
             <w:r>
               <w:br/>
-              <w:t>List&lt;</w:t>
-            </w:r>
-            <w:proofErr w:type="spellStart"/>
-            <w:r>
-              <w:t>FoodItem</w:t>
-            </w:r>
-            <w:proofErr w:type="spellEnd"/>
-            <w:r>
-              <w:t>&gt; lunch;</w:t>
+              <w:t>List&lt;FoodItem&gt; lunch;</w:t>
             </w:r>
             <w:r>
               <w:br/>
-              <w:t>List&lt;</w:t>
-            </w:r>
-            <w:proofErr w:type="spellStart"/>
-            <w:r>
-              <w:t>FoodItem</w:t>
-            </w:r>
-            <w:proofErr w:type="spellEnd"/>
-            <w:r>
-              <w:t>&gt; dinner;</w:t>
+              <w:t>List&lt;FoodItem&gt; dinner;</w:t>
             </w:r>
             <w:r>
               <w:br/>
-              <w:t>List&lt;</w:t>
-            </w:r>
-            <w:proofErr w:type="spellStart"/>
-            <w:r>
-              <w:t>FoodItem</w:t>
-            </w:r>
-            <w:proofErr w:type="spellEnd"/>
-            <w:r>
-              <w:t>&gt; snacks;</w:t>
+              <w:t>List&lt;FoodItem&gt; snacks;</w:t>
             </w:r>
           </w:p>
         </w:tc>
@@ -2739,7 +2334,6 @@
           </w:tcPr>
           <w:p>
             <w:r>
-              <w:lastRenderedPageBreak/>
               <w:t>Justin Smith</w:t>
             </w:r>
           </w:p>
@@ -2754,6 +2348,90 @@
             </w:r>
             <w:r>
               <w:t xml:space="preserve"> (Pull Request #41)</w:t>
+            </w:r>
+          </w:p>
+        </w:tc>
+      </w:tr>
+      <w:tr>
+        <w:tc>
+          <w:tcPr>
+            <w:tcW w:w="1615" w:type="dxa"/>
+          </w:tcPr>
+          <w:p>
+            <w:r>
+              <w:t>Emi Collins</w:t>
+            </w:r>
+          </w:p>
+        </w:tc>
+        <w:tc>
+          <w:tcPr>
+            <w:tcW w:w="7735" w:type="dxa"/>
+          </w:tcPr>
+          <w:p>
+            <w:r>
+              <w:t>Made the UI for the Create Account Page. Page has a field for username and password, as well as the option to select initial dietary goal and amount. Can navigate back to login page if needed once hooked up</w:t>
+            </w:r>
+            <w:r>
+              <w:t xml:space="preserve"> (Commit </w:t>
+            </w:r>
+            <w:r>
+              <w:t>a4dd2cd0)</w:t>
+            </w:r>
+          </w:p>
+        </w:tc>
+      </w:tr>
+      <w:tr>
+        <w:tc>
+          <w:tcPr>
+            <w:tcW w:w="1615" w:type="dxa"/>
+          </w:tcPr>
+          <w:p>
+            <w:r>
+              <w:t>Emi Collins</w:t>
+            </w:r>
+          </w:p>
+        </w:tc>
+        <w:tc>
+          <w:tcPr>
+            <w:tcW w:w="7735" w:type="dxa"/>
+          </w:tcPr>
+          <w:p>
+            <w:pPr>
+              <w:jc w:val="center"/>
+            </w:pPr>
+            <w:r>
+              <w:t>Updated Create Account UI to have fields for all goals instead of just primary, so the user can chose to set those during initialization of account.</w:t>
+            </w:r>
+            <w:r>
+              <w:t xml:space="preserve"> (Commit c3575d0)</w:t>
+            </w:r>
+          </w:p>
+        </w:tc>
+      </w:tr>
+      <w:tr>
+        <w:tc>
+          <w:tcPr>
+            <w:tcW w:w="1615" w:type="dxa"/>
+          </w:tcPr>
+          <w:p>
+            <w:r>
+              <w:t>Emi Collins</w:t>
+            </w:r>
+          </w:p>
+        </w:tc>
+        <w:tc>
+          <w:tcPr>
+            <w:tcW w:w="7735" w:type="dxa"/>
+          </w:tcPr>
+          <w:p>
+            <w:pPr>
+              <w:jc w:val="center"/>
+            </w:pPr>
+            <w:r>
+              <w:t>Updated Python class diagram to include server classes and relationships, as well as the database.</w:t>
+            </w:r>
+            <w:r>
+              <w:t xml:space="preserve"> (Commit 91f0ff2)</w:t>
             </w:r>
           </w:p>
         </w:tc>
@@ -2827,6 +2505,7 @@
                 <w:b/>
                 <w:bCs/>
               </w:rPr>
+              <w:lastRenderedPageBreak/>
               <w:t>Priority</w:t>
             </w:r>
           </w:p>
@@ -3011,23 +2690,7 @@
                 <w:rFonts w:ascii="Calibri" w:hAnsi="Calibri" w:cs="Calibri"/>
                 <w:color w:val="000000"/>
               </w:rPr>
-              <w:t xml:space="preserve">Update </w:t>
-            </w:r>
-            <w:proofErr w:type="spellStart"/>
-            <w:r>
-              <w:rPr>
-                <w:rFonts w:ascii="Calibri" w:hAnsi="Calibri" w:cs="Calibri"/>
-                <w:color w:val="000000"/>
-              </w:rPr>
-              <w:t>DayOfFood</w:t>
-            </w:r>
-            <w:proofErr w:type="spellEnd"/>
-            <w:r>
-              <w:rPr>
-                <w:rFonts w:ascii="Calibri" w:hAnsi="Calibri" w:cs="Calibri"/>
-                <w:color w:val="000000"/>
-              </w:rPr>
-              <w:t xml:space="preserve"> Process Client Side</w:t>
+              <w:t>Update DayOfFood Process Client Side</w:t>
             </w:r>
           </w:p>
         </w:tc>
@@ -3080,23 +2743,7 @@
                 <w:rFonts w:ascii="Calibri" w:hAnsi="Calibri" w:cs="Calibri"/>
                 <w:color w:val="000000"/>
               </w:rPr>
-              <w:t xml:space="preserve">Update </w:t>
-            </w:r>
-            <w:proofErr w:type="spellStart"/>
-            <w:r>
-              <w:rPr>
-                <w:rFonts w:ascii="Calibri" w:hAnsi="Calibri" w:cs="Calibri"/>
-                <w:color w:val="000000"/>
-              </w:rPr>
-              <w:t>DayOfFood</w:t>
-            </w:r>
-            <w:proofErr w:type="spellEnd"/>
-            <w:r>
-              <w:rPr>
-                <w:rFonts w:ascii="Calibri" w:hAnsi="Calibri" w:cs="Calibri"/>
-                <w:color w:val="000000"/>
-              </w:rPr>
-              <w:t xml:space="preserve"> Process Server Side</w:t>
+              <w:t>Update DayOfFood Process Server Side</w:t>
             </w:r>
           </w:p>
         </w:tc>
@@ -3149,17 +2796,8 @@
                 <w:rFonts w:ascii="Calibri" w:hAnsi="Calibri" w:cs="Calibri"/>
                 <w:color w:val="000000"/>
               </w:rPr>
-              <w:t xml:space="preserve">Add Food </w:t>
-            </w:r>
-            <w:proofErr w:type="spellStart"/>
-            <w:r>
-              <w:rPr>
-                <w:rFonts w:ascii="Calibri" w:hAnsi="Calibri" w:cs="Calibri"/>
-                <w:color w:val="000000"/>
-              </w:rPr>
-              <w:t>Codebehind</w:t>
-            </w:r>
-            <w:proofErr w:type="spellEnd"/>
+              <w:t>Add Food Codebehind</w:t>
+            </w:r>
           </w:p>
         </w:tc>
         <w:tc>
@@ -3205,23 +2843,7 @@
                 <w:rFonts w:ascii="Calibri" w:hAnsi="Calibri" w:cs="Calibri"/>
                 <w:color w:val="000000"/>
               </w:rPr>
-              <w:t xml:space="preserve">Update </w:t>
-            </w:r>
-            <w:proofErr w:type="spellStart"/>
-            <w:r>
-              <w:rPr>
-                <w:rFonts w:ascii="Calibri" w:hAnsi="Calibri" w:cs="Calibri"/>
-                <w:color w:val="000000"/>
-              </w:rPr>
-              <w:t>HomeDashboard</w:t>
-            </w:r>
-            <w:proofErr w:type="spellEnd"/>
-            <w:r>
-              <w:rPr>
-                <w:rFonts w:ascii="Calibri" w:hAnsi="Calibri" w:cs="Calibri"/>
-                <w:color w:val="000000"/>
-              </w:rPr>
-              <w:t xml:space="preserve"> UI</w:t>
+              <w:t>Update HomeDashboard UI</w:t>
             </w:r>
           </w:p>
         </w:tc>
@@ -3315,33 +2937,8 @@
                 <w:rFonts w:ascii="Calibri" w:hAnsi="Calibri" w:cs="Calibri"/>
                 <w:color w:val="000000"/>
               </w:rPr>
-              <w:t xml:space="preserve">Update </w:t>
-            </w:r>
-            <w:proofErr w:type="spellStart"/>
-            <w:r>
-              <w:rPr>
-                <w:rFonts w:ascii="Calibri" w:hAnsi="Calibri" w:cs="Calibri"/>
-                <w:color w:val="000000"/>
-              </w:rPr>
-              <w:t>HomeDashboard</w:t>
-            </w:r>
-            <w:proofErr w:type="spellEnd"/>
-            <w:r>
-              <w:rPr>
-                <w:rFonts w:ascii="Calibri" w:hAnsi="Calibri" w:cs="Calibri"/>
-                <w:color w:val="000000"/>
-              </w:rPr>
-              <w:t xml:space="preserve"> </w:t>
-            </w:r>
-            <w:proofErr w:type="spellStart"/>
-            <w:r>
-              <w:rPr>
-                <w:rFonts w:ascii="Calibri" w:hAnsi="Calibri" w:cs="Calibri"/>
-                <w:color w:val="000000"/>
-              </w:rPr>
-              <w:t>Codebehind</w:t>
-            </w:r>
-            <w:proofErr w:type="spellEnd"/>
+              <w:t>Update HomeDashboard Codebehind</w:t>
+            </w:r>
           </w:p>
         </w:tc>
         <w:tc>
@@ -3575,17 +3172,8 @@
                 <w:rFonts w:ascii="Calibri" w:hAnsi="Calibri" w:cs="Calibri"/>
                 <w:color w:val="000000"/>
               </w:rPr>
-              <w:t xml:space="preserve">Edit Diet </w:t>
-            </w:r>
-            <w:proofErr w:type="spellStart"/>
-            <w:r>
-              <w:rPr>
-                <w:rFonts w:ascii="Calibri" w:hAnsi="Calibri" w:cs="Calibri"/>
-                <w:color w:val="000000"/>
-              </w:rPr>
-              <w:t>Codebehind</w:t>
-            </w:r>
-            <w:proofErr w:type="spellEnd"/>
+              <w:t>Edit Diet Codebehind</w:t>
+            </w:r>
           </w:p>
         </w:tc>
         <w:tc>
@@ -3641,23 +3229,7 @@
           <w:b/>
           <w:bCs/>
         </w:rPr>
-        <w:t xml:space="preserve"> session where you </w:t>
-      </w:r>
-      <w:proofErr w:type="gramStart"/>
-      <w:r>
-        <w:rPr>
-          <w:b/>
-          <w:bCs/>
-        </w:rPr>
-        <w:t>used</w:t>
-      </w:r>
-      <w:proofErr w:type="gramEnd"/>
-      <w:r>
-        <w:rPr>
-          <w:b/>
-          <w:bCs/>
-        </w:rPr>
-        <w:t xml:space="preserve"> generative AI, give the following:</w:t>
+        <w:t xml:space="preserve"> session where you used generative AI, give the following:</w:t>
       </w:r>
     </w:p>
     <w:p>
@@ -4041,23 +3613,7 @@
           <w:b/>
           <w:bCs/>
         </w:rPr>
-        <w:t xml:space="preserve">Generate example code of how to connect </w:t>
-      </w:r>
-      <w:proofErr w:type="gramStart"/>
-      <w:r>
-        <w:rPr>
-          <w:b/>
-          <w:bCs/>
-        </w:rPr>
-        <w:t>client</w:t>
-      </w:r>
-      <w:proofErr w:type="gramEnd"/>
-      <w:r>
-        <w:rPr>
-          <w:b/>
-          <w:bCs/>
-        </w:rPr>
-        <w:t xml:space="preserve"> and server for adding food data</w:t>
+        <w:t>Generate example code of how to connect client and server for adding food data</w:t>
       </w:r>
     </w:p>
     <w:p>
@@ -4488,23 +4044,7 @@
           <w:b/>
           <w:bCs/>
         </w:rPr>
-        <w:t xml:space="preserve">Create test cases for the </w:t>
-      </w:r>
-      <w:proofErr w:type="spellStart"/>
-      <w:r>
-        <w:rPr>
-          <w:b/>
-          <w:bCs/>
-        </w:rPr>
-        <w:t>base_food</w:t>
-      </w:r>
-      <w:proofErr w:type="spellEnd"/>
-      <w:r>
-        <w:rPr>
-          <w:b/>
-          <w:bCs/>
-        </w:rPr>
-        <w:t xml:space="preserve"> model class on the python project.</w:t>
+        <w:t>Create test cases for the base_food model class on the python project.</w:t>
       </w:r>
     </w:p>
     <w:p>
@@ -4641,23 +4181,7 @@
           <w:b/>
           <w:bCs/>
         </w:rPr>
-        <w:t xml:space="preserve">Create test cases for the create </w:t>
-      </w:r>
-      <w:proofErr w:type="gramStart"/>
-      <w:r>
-        <w:rPr>
-          <w:b/>
-          <w:bCs/>
-        </w:rPr>
-        <w:t>account Java client</w:t>
-      </w:r>
-      <w:proofErr w:type="gramEnd"/>
-      <w:r>
-        <w:rPr>
-          <w:b/>
-          <w:bCs/>
-        </w:rPr>
-        <w:t>.</w:t>
+        <w:t>Create test cases for the create account Java client.</w:t>
       </w:r>
     </w:p>
     <w:p>
@@ -6593,7 +6117,6 @@
   <w:style w:type="character" w:default="1" w:styleId="DefaultParagraphFont">
     <w:name w:val="Default Paragraph Font"/>
     <w:uiPriority w:val="1"/>
-    <w:semiHidden/>
     <w:unhideWhenUsed/>
   </w:style>
   <w:style w:type="table" w:default="1" w:styleId="TableNormal">

</xml_diff>